<commit_message>
addition of sound effects folder
Sound effects folder under Additional Class Resources. Sounds are pre-crushed.
</commit_message>
<xml_diff>
--- a/Additional Class Resources/werewolf_escape_scripts.docx
+++ b/Additional Class Resources/werewolf_escape_scripts.docx
@@ -105,11 +105,16 @@
     </w:p>
     <w:p>
       <w:r>
-        <w:t>[Diary</w:t>
+        <w:t>[</w:t>
+      </w:r>
+      <w:proofErr w:type="spellStart"/>
+      <w:r>
+        <w:t>Diary</w:t>
       </w:r>
       <w:r>
         <w:t>_Doc</w:t>
       </w:r>
+      <w:proofErr w:type="spellEnd"/>
       <w:r>
         <w:t xml:space="preserve"> / 1 / Interacting with “Diary” item]</w:t>
       </w:r>
@@ -136,7 +141,15 @@
     </w:p>
     <w:p>
       <w:r>
-        <w:t>“Bella doesn’t like milk or vegetables. Sydney is still having a hard time with solid foods. (Her yogurt is on the top shelf of the fridge because she keeps getting into there somehow. DO NOT LET HER HAVE IT WHENEVER SHE WANTS!!!)</w:t>
+        <w:t xml:space="preserve">“Bella doesn’t like milk or vegetables. Sydney is still having a hard time with solid foods. (Her yogurt is on the top shelf of the fridge because she keeps getting into </w:t>
+      </w:r>
+      <w:proofErr w:type="spellStart"/>
+      <w:r>
+        <w:t>there</w:t>
+      </w:r>
+      <w:proofErr w:type="spellEnd"/>
+      <w:r>
+        <w:t xml:space="preserve"> somehow. DO NOT LET HER HAVE IT WHENEVER SHE WANTS!!!)</w:t>
       </w:r>
     </w:p>
     <w:p>
@@ -160,6 +173,78 @@
         <w:t>1</w:t>
       </w:r>
     </w:p>
+    <w:p/>
+    <w:p>
+      <w:r>
+        <w:t>[</w:t>
+      </w:r>
+      <w:proofErr w:type="spellStart"/>
+      <w:r>
+        <w:t>Diary_Doc</w:t>
+      </w:r>
+      <w:proofErr w:type="spellEnd"/>
+      <w:r>
+        <w:t xml:space="preserve"> / </w:t>
+      </w:r>
+      <w:r>
+        <w:t>2</w:t>
+      </w:r>
+      <w:r>
+        <w:t xml:space="preserve"> / Interacting with “Diary” item]</w:t>
+      </w:r>
+    </w:p>
+    <w:p>
+      <w:r>
+        <w:t xml:space="preserve">“DON’T FORGET Bella’s soccer practice on Tues and Thurs again!! </w:t>
+      </w:r>
+    </w:p>
+    <w:p>
+      <w:r>
+        <w:t>“Looking into colloidal silver for my condition – might turn me blue??? &lt;- LOOK INTO THIS</w:t>
+      </w:r>
+    </w:p>
+    <w:p>
+      <w:r>
+        <w:t>“look up daycare ratings”</w:t>
+      </w:r>
+    </w:p>
+    <w:p>
+      <w:r>
+        <w:t>[</w:t>
+      </w:r>
+      <w:r>
+        <w:t>178</w:t>
+      </w:r>
+      <w:r>
+        <w:t>]</w:t>
+      </w:r>
+    </w:p>
+    <w:p>
+      <w:r>
+        <w:lastRenderedPageBreak/>
+        <w:t>1</w:t>
+      </w:r>
+    </w:p>
+    <w:p/>
+    <w:p>
+      <w:r>
+        <w:t>[</w:t>
+      </w:r>
+      <w:proofErr w:type="spellStart"/>
+      <w:r>
+        <w:t>Diary_Doc</w:t>
+      </w:r>
+      <w:proofErr w:type="spellEnd"/>
+      <w:r>
+        <w:t xml:space="preserve"> / </w:t>
+      </w:r>
+      <w:r>
+        <w:t>3</w:t>
+      </w:r>
+      <w:r>
+        <w:t xml:space="preserve"> / Interacting with “Diary” item]</w:t>
+      </w:r>
+    </w:p>
     <w:p>
       <w:pPr>
         <w:rPr>
@@ -167,10 +252,346 @@
           <w:iCs/>
         </w:rPr>
       </w:pPr>
-    </w:p>
-    <w:p>
-      <w:r>
-        <w:t>[Diary_Doc / 2 / Interacting with “Diary” item]</w:t>
+      <w:r>
+        <w:rPr>
+          <w:i/>
+          <w:iCs/>
+        </w:rPr>
+        <w:t xml:space="preserve">There’s a lot of pages torn out after this. </w:t>
+      </w:r>
+    </w:p>
+    <w:p>
+      <w:r>
+        <w:t>“Moon on the 18</w:t>
+      </w:r>
+      <w:r>
+        <w:rPr>
+          <w:vertAlign w:val="superscript"/>
+        </w:rPr>
+        <w:t>th</w:t>
+      </w:r>
+      <w:r>
+        <w:t xml:space="preserve"> this month</w:t>
+      </w:r>
+    </w:p>
+    <w:p>
+      <w:r>
+        <w:t>“Moon on the 18</w:t>
+      </w:r>
+      <w:r>
+        <w:rPr>
+          <w:vertAlign w:val="superscript"/>
+        </w:rPr>
+        <w:t>th</w:t>
+      </w:r>
+      <w:r>
+        <w:t xml:space="preserve"> this month</w:t>
+      </w:r>
+    </w:p>
+    <w:p>
+      <w:r>
+        <w:t xml:space="preserve">“I </w:t>
+      </w:r>
+      <w:proofErr w:type="spellStart"/>
+      <w:r>
+        <w:t>dont</w:t>
+      </w:r>
+      <w:proofErr w:type="spellEnd"/>
+      <w:r>
+        <w:t xml:space="preserve"> like the way this new </w:t>
+      </w:r>
+      <w:proofErr w:type="spellStart"/>
+      <w:r>
+        <w:t>treatmnt</w:t>
+      </w:r>
+      <w:proofErr w:type="spellEnd"/>
+      <w:r>
+        <w:t xml:space="preserve"> makes me feel with all these </w:t>
+      </w:r>
+      <w:r>
+        <w:t xml:space="preserve">mushrooms and tonics and I honestly don’t think </w:t>
+      </w:r>
+      <w:proofErr w:type="spellStart"/>
+      <w:proofErr w:type="gramStart"/>
+      <w:r>
+        <w:t>its</w:t>
+      </w:r>
+      <w:proofErr w:type="spellEnd"/>
+      <w:proofErr w:type="gramEnd"/>
+      <w:r>
+        <w:t xml:space="preserve"> getting any better </w:t>
+      </w:r>
+    </w:p>
+    <w:p>
+      <w:r>
+        <w:t>“</w:t>
+      </w:r>
+      <w:r>
+        <w:t>i’m forgetting their faces and their names don’t fit in my mouth anymore”</w:t>
+      </w:r>
+    </w:p>
+    <w:p>
+      <w:r>
+        <w:t>[</w:t>
+      </w:r>
+      <w:r>
+        <w:t>313</w:t>
+      </w:r>
+      <w:r>
+        <w:t>]</w:t>
+      </w:r>
+    </w:p>
+    <w:p>
+      <w:r>
+        <w:t>1</w:t>
+      </w:r>
+    </w:p>
+    <w:p/>
+    <w:p>
+      <w:r>
+        <w:t>[</w:t>
+      </w:r>
+      <w:proofErr w:type="spellStart"/>
+      <w:r>
+        <w:t>Diary_Doc</w:t>
+      </w:r>
+      <w:proofErr w:type="spellEnd"/>
+      <w:r>
+        <w:t xml:space="preserve"> / </w:t>
+      </w:r>
+      <w:r>
+        <w:t>4</w:t>
+      </w:r>
+      <w:r>
+        <w:t xml:space="preserve"> / Interacting with “Diary” item]</w:t>
+      </w:r>
+    </w:p>
+    <w:p>
+      <w:r>
+        <w:t>“Get milk, yogurt at store</w:t>
+      </w:r>
+    </w:p>
+    <w:p>
+      <w:r>
+        <w:t>“Get more ginseng at that market... seems to help with the memory loss</w:t>
+      </w:r>
+      <w:r>
+        <w:t xml:space="preserve"> </w:t>
+      </w:r>
+      <w:r>
+        <w:t xml:space="preserve">(but ONLY </w:t>
+      </w:r>
+      <w:r>
+        <w:t xml:space="preserve">if </w:t>
+      </w:r>
+      <w:r>
+        <w:t>it’s the first component!!!)</w:t>
+      </w:r>
+    </w:p>
+    <w:p>
+      <w:r>
+        <w:t>“Find Brigette’s obit”</w:t>
+      </w:r>
+    </w:p>
+    <w:p>
+      <w:r>
+        <w:t>[</w:t>
+      </w:r>
+      <w:r>
+        <w:t>160</w:t>
+      </w:r>
+      <w:r>
+        <w:t>]</w:t>
+      </w:r>
+    </w:p>
+    <w:p>
+      <w:r>
+        <w:t>1</w:t>
+      </w:r>
+    </w:p>
+    <w:p/>
+    <w:p>
+      <w:r>
+        <w:t>[</w:t>
+      </w:r>
+      <w:proofErr w:type="spellStart"/>
+      <w:r>
+        <w:t>Diary_Doc</w:t>
+      </w:r>
+      <w:proofErr w:type="spellEnd"/>
+      <w:r>
+        <w:t xml:space="preserve"> / </w:t>
+      </w:r>
+      <w:r>
+        <w:t>5</w:t>
+      </w:r>
+      <w:r>
+        <w:t xml:space="preserve"> / Interacting with “Diary” item]</w:t>
+      </w:r>
+    </w:p>
+    <w:p>
+      <w:r>
+        <w:t>“More boards for cabin</w:t>
+      </w:r>
+    </w:p>
+    <w:p>
+      <w:r>
+        <w:t>“Ask Janet if she can take the kids for a couple weeks</w:t>
+      </w:r>
+    </w:p>
+    <w:p>
+      <w:r>
+        <w:t>“</w:t>
+      </w:r>
+      <w:r>
+        <w:t>mixed</w:t>
+      </w:r>
+      <w:r>
+        <w:t xml:space="preserve"> all</w:t>
+      </w:r>
+      <w:r>
+        <w:t xml:space="preserve"> </w:t>
+      </w:r>
+      <w:r>
+        <w:t>plant</w:t>
+      </w:r>
+      <w:r>
+        <w:t xml:space="preserve"> parts FIRST then </w:t>
+      </w:r>
+      <w:r>
+        <w:t>added</w:t>
+      </w:r>
+      <w:r>
+        <w:t xml:space="preserve"> silver</w:t>
+      </w:r>
+      <w:r>
+        <w:t xml:space="preserve"> </w:t>
+      </w:r>
+      <w:r>
+        <w:t>= bought myself an extra day w/out the change</w:t>
+      </w:r>
+    </w:p>
+    <w:p>
+      <w:r>
+        <w:t>“gonna try to source</w:t>
+      </w:r>
+      <w:r>
+        <w:t xml:space="preserve"> some kind of liquid for </w:t>
+      </w:r>
+      <w:r>
+        <w:t xml:space="preserve">the last bit of </w:t>
+      </w:r>
+      <w:r>
+        <w:t>binding??</w:t>
+      </w:r>
+      <w:r>
+        <w:t>”</w:t>
+      </w:r>
+    </w:p>
+    <w:p>
+      <w:r>
+        <w:t>[</w:t>
+      </w:r>
+      <w:r>
+        <w:t>239</w:t>
+      </w:r>
+      <w:r>
+        <w:t>]</w:t>
+      </w:r>
+    </w:p>
+    <w:p>
+      <w:r>
+        <w:t>1</w:t>
+      </w:r>
+    </w:p>
+    <w:p/>
+    <w:p>
+      <w:r>
+        <w:lastRenderedPageBreak/>
+        <w:t>[</w:t>
+      </w:r>
+      <w:proofErr w:type="spellStart"/>
+      <w:r>
+        <w:t>Diary_Doc</w:t>
+      </w:r>
+      <w:proofErr w:type="spellEnd"/>
+      <w:r>
+        <w:t xml:space="preserve"> / </w:t>
+      </w:r>
+      <w:r>
+        <w:t>6</w:t>
+      </w:r>
+      <w:r>
+        <w:t xml:space="preserve"> / Interacting with “Diary” item]</w:t>
+      </w:r>
+    </w:p>
+    <w:p>
+      <w:r>
+        <w:t>“</w:t>
+      </w:r>
+      <w:r>
+        <w:t>blood is the only thing that works</w:t>
+      </w:r>
+    </w:p>
+    <w:p>
+      <w:r>
+        <w:t>“</w:t>
+      </w:r>
+      <w:r>
+        <w:t>I</w:t>
+      </w:r>
+      <w:r>
+        <w:t xml:space="preserve"> don’t know how </w:t>
+      </w:r>
+      <w:r>
+        <w:t>I</w:t>
+      </w:r>
+      <w:r>
+        <w:t xml:space="preserve"> know this</w:t>
+      </w:r>
+    </w:p>
+    <w:p>
+      <w:r>
+        <w:t>“god i don’t remember what I’ve done but I’m sorry</w:t>
+      </w:r>
+      <w:r>
+        <w:t>”</w:t>
+      </w:r>
+    </w:p>
+    <w:p>
+      <w:r>
+        <w:t>[</w:t>
+      </w:r>
+      <w:r>
+        <w:t>115</w:t>
+      </w:r>
+      <w:r>
+        <w:t>]</w:t>
+      </w:r>
+    </w:p>
+    <w:p>
+      <w:r>
+        <w:t>1</w:t>
+      </w:r>
+    </w:p>
+    <w:p/>
+    <w:p>
+      <w:r>
+        <w:t>[</w:t>
+      </w:r>
+      <w:proofErr w:type="spellStart"/>
+      <w:r>
+        <w:t>Diary_Doc</w:t>
+      </w:r>
+      <w:proofErr w:type="spellEnd"/>
+      <w:r>
+        <w:t xml:space="preserve"> / </w:t>
+      </w:r>
+      <w:r>
+        <w:t>7</w:t>
+      </w:r>
+      <w:r>
+        <w:t xml:space="preserve"> / Interacting with “Diary” item]</w:t>
       </w:r>
     </w:p>
     <w:p>
@@ -185,12 +606,40 @@
           <w:i/>
           <w:iCs/>
         </w:rPr>
-        <w:t>There’s some red pen in the margin...</w:t>
-      </w:r>
-    </w:p>
-    <w:p>
-      <w:r>
-        <w:t>“Brigette brigette briggete don’t forget what you did”</w:t>
+        <w:t>More missing pages.</w:t>
+      </w:r>
+    </w:p>
+    <w:p>
+      <w:r>
+        <w:t>“I am so lonely in here and so restless</w:t>
+      </w:r>
+    </w:p>
+    <w:p>
+      <w:r>
+        <w:t>“There is no one on the outside of here I have boarded myself in like the allegory of the cave and I wonder if the world is more scared of me or I of IT!!!</w:t>
+      </w:r>
+    </w:p>
+    <w:p>
+      <w:r>
+        <w:t xml:space="preserve">“I see under my hands a very familiar woman and I am looking down at her through a fisheye and she is stretching and her mouth is pulling out and open like drowning above air and I realize it’s just the hammer as I nail another board but my hands are still around its </w:t>
+      </w:r>
+      <w:proofErr w:type="spellStart"/>
+      <w:r>
+        <w:t>neeeeck</w:t>
+      </w:r>
+      <w:proofErr w:type="spellEnd"/>
+    </w:p>
+    <w:p>
+      <w:r>
+        <w:t xml:space="preserve">“visit </w:t>
+      </w:r>
+      <w:proofErr w:type="spellStart"/>
+      <w:r>
+        <w:t>brigette</w:t>
+      </w:r>
+      <w:proofErr w:type="spellEnd"/>
+      <w:r>
+        <w:t xml:space="preserve"> soon”</w:t>
       </w:r>
     </w:p>
     <w:p>
@@ -198,7 +647,7 @@
         <w:t>[</w:t>
       </w:r>
       <w:r>
-        <w:t>91</w:t>
+        <w:t>509</w:t>
       </w:r>
       <w:r>
         <w:t>]</w:t>
@@ -212,7 +661,316 @@
     <w:p/>
     <w:p>
       <w:r>
-        <w:t>[Diary_Doc / 3 / Interacting with “Diary” item]</w:t>
+        <w:t>[</w:t>
+      </w:r>
+      <w:proofErr w:type="spellStart"/>
+      <w:r>
+        <w:t>Diary_Doc</w:t>
+      </w:r>
+      <w:proofErr w:type="spellEnd"/>
+      <w:r>
+        <w:t xml:space="preserve"> / </w:t>
+      </w:r>
+      <w:r>
+        <w:t>8</w:t>
+      </w:r>
+      <w:r>
+        <w:t xml:space="preserve"> / Interacting with “Diary” item]</w:t>
+      </w:r>
+    </w:p>
+    <w:p>
+      <w:r>
+        <w:t xml:space="preserve">“Moon </w:t>
+      </w:r>
+      <w:proofErr w:type="spellStart"/>
+      <w:r>
+        <w:t>tonite</w:t>
+      </w:r>
+      <w:proofErr w:type="spellEnd"/>
+      <w:r>
+        <w:t xml:space="preserve"> moon </w:t>
+      </w:r>
+      <w:proofErr w:type="spellStart"/>
+      <w:r>
+        <w:t>tonite</w:t>
+      </w:r>
+      <w:proofErr w:type="spellEnd"/>
+      <w:r>
+        <w:t xml:space="preserve"> moon</w:t>
+      </w:r>
+    </w:p>
+    <w:p>
+      <w:r>
+        <w:t xml:space="preserve">“there is something I need in the cabinet shiny silver glinting </w:t>
+      </w:r>
+      <w:proofErr w:type="gramStart"/>
+      <w:r>
+        <w:t>red blue</w:t>
+      </w:r>
+      <w:proofErr w:type="gramEnd"/>
+      <w:r>
+        <w:t xml:space="preserve"> yellow green</w:t>
+      </w:r>
+    </w:p>
+    <w:p>
+      <w:r>
+        <w:t>“the beam will hit and I will be whole again”</w:t>
+      </w:r>
+    </w:p>
+    <w:p>
+      <w:r>
+        <w:t>[</w:t>
+      </w:r>
+      <w:r>
+        <w:t>149</w:t>
+      </w:r>
+      <w:r>
+        <w:t>]</w:t>
+      </w:r>
+    </w:p>
+    <w:p>
+      <w:r>
+        <w:t>1</w:t>
+      </w:r>
+    </w:p>
+    <w:p/>
+    <w:p>
+      <w:r>
+        <w:t>[</w:t>
+      </w:r>
+      <w:proofErr w:type="spellStart"/>
+      <w:r>
+        <w:t>Newspaper_Doc</w:t>
+      </w:r>
+      <w:proofErr w:type="spellEnd"/>
+      <w:r>
+        <w:t xml:space="preserve"> / </w:t>
+      </w:r>
+      <w:r>
+        <w:t>Page</w:t>
+      </w:r>
+      <w:r>
+        <w:t xml:space="preserve"> in </w:t>
+      </w:r>
+      <w:r>
+        <w:t>e</w:t>
+      </w:r>
+      <w:r>
+        <w:t>nvironment]</w:t>
+      </w:r>
+    </w:p>
+    <w:p>
+      <w:r>
+        <w:t>“Sudden death of local woman reignites coyote fears</w:t>
+      </w:r>
+    </w:p>
+    <w:p>
+      <w:r>
+        <w:lastRenderedPageBreak/>
+        <w:t xml:space="preserve">“Local dog groomer Brigette Morgan was found dead early Monday morning after a search party uncovered her body in Sawyer Creek. </w:t>
+      </w:r>
+      <w:r>
+        <w:t>Authorities at the scene say that she was found, ‘With her throat ripped out, like some animal had done it.’</w:t>
+      </w:r>
+    </w:p>
+    <w:p>
+      <w:r>
+        <w:t xml:space="preserve">“In an official statement, Police Chief Arthur Van Holt added, ‘Our forensics analysts pinned down, without a doubt, a bite radius that suggests a big-muzzled animal, coyote, somethin [sic] like that. It’s a horrible tragedy that reminds all of us to keep an eye on our dogs, keep an eye on our kids, keep out the way of nature and keep on </w:t>
+      </w:r>
+      <w:proofErr w:type="spellStart"/>
+      <w:r>
+        <w:t>keepin</w:t>
+      </w:r>
+      <w:proofErr w:type="spellEnd"/>
+      <w:r>
+        <w:t xml:space="preserve"> [sic] on with our own human business. Our hearts are with Miss Morgan’s family.’</w:t>
+      </w:r>
+    </w:p>
+    <w:p>
+      <w:r>
+        <w:t xml:space="preserve">“Morgan is survived by her husband, Lucas Morgan, and her two children, Bella and Sydney Morgan. </w:t>
+      </w:r>
+    </w:p>
+    <w:p>
+      <w:r>
+        <w:t>“’She was a pillar of the community,’ says Tanya Stone, Morgan’s apprentice. ‘Everybody knew she was just as compassionate to people as she was to animals.’”</w:t>
+      </w:r>
+    </w:p>
+    <w:p>
+      <w:r>
+        <w:t>[968]</w:t>
+      </w:r>
+    </w:p>
+    <w:p>
+      <w:r>
+        <w:t>2</w:t>
+      </w:r>
+    </w:p>
+    <w:p/>
+    <w:p>
+      <w:r>
+        <w:t>[</w:t>
+      </w:r>
+      <w:proofErr w:type="spellStart"/>
+      <w:r>
+        <w:t>BookPage_Doc</w:t>
+      </w:r>
+      <w:proofErr w:type="spellEnd"/>
+      <w:r>
+        <w:t xml:space="preserve"> / Page in environment]</w:t>
+      </w:r>
+    </w:p>
+    <w:p>
+      <w:r>
+        <w:rPr>
+          <w:lang w:val="de-DE"/>
+        </w:rPr>
+        <w:t>„Der Wolfsmensch (oder, immer beliebter, der ‚Werwolf‘) besitzt eine unvergleichliche Physiologie – nicht nur dehnt sich die Muskulatur, um das Wachstum von Schnauze, Ohren und zusätzlichen Gelenken zu ermöglichen, sondern wir können auch von der Entwicklung temporärer Knochen ausgehen.“</w:t>
+      </w:r>
+    </w:p>
+    <w:p>
+      <w:r>
+        <w:t>[288]</w:t>
+      </w:r>
+    </w:p>
+    <w:p>
+      <w:r>
+        <w:t>2</w:t>
+      </w:r>
+    </w:p>
+    <w:p/>
+    <w:p>
+      <w:r>
+        <w:t>[</w:t>
+      </w:r>
+      <w:proofErr w:type="spellStart"/>
+      <w:r>
+        <w:t>Magazine</w:t>
+      </w:r>
+      <w:r>
+        <w:t>_Doc</w:t>
+      </w:r>
+      <w:proofErr w:type="spellEnd"/>
+      <w:r>
+        <w:t xml:space="preserve"> / Page in environment]</w:t>
+      </w:r>
+    </w:p>
+    <w:p>
+      <w:r>
+        <w:t>“Common Signs of Scared Dogs</w:t>
+      </w:r>
+    </w:p>
+    <w:p>
+      <w:r>
+        <w:t>“</w:t>
+      </w:r>
+      <w:r>
+        <w:t xml:space="preserve">Though ascribed often to anger, the number one cause of </w:t>
+      </w:r>
+      <w:r>
+        <w:t xml:space="preserve">dog bites is actually fear. </w:t>
+      </w:r>
+      <w:r>
+        <w:t>But d</w:t>
+      </w:r>
+      <w:r>
+        <w:t>istinguishing fear from excitement can be incredibly difficult for the average dog owner</w:t>
+      </w:r>
+      <w:r>
+        <w:t xml:space="preserve">... and that’s where our short guide comes in! </w:t>
+      </w:r>
+      <w:r>
+        <w:t xml:space="preserve">Learning to recognize scared dogs </w:t>
+      </w:r>
+      <w:proofErr w:type="gramStart"/>
+      <w:r>
+        <w:t>ensures</w:t>
+      </w:r>
+      <w:proofErr w:type="gramEnd"/>
+      <w:r>
+        <w:t xml:space="preserve"> </w:t>
+      </w:r>
+      <w:r>
+        <w:t xml:space="preserve">not only </w:t>
+      </w:r>
+      <w:r>
+        <w:t xml:space="preserve">the safety of your own pets, but young children, the elderly, and those inexperienced with animals. </w:t>
+      </w:r>
+    </w:p>
+    <w:p>
+      <w:r>
+        <w:t>“</w:t>
+      </w:r>
+      <w:r>
+        <w:t xml:space="preserve">DO NOT use these tips to approach wild or otherwise </w:t>
+      </w:r>
+      <w:r>
+        <w:t xml:space="preserve">highly </w:t>
+      </w:r>
+      <w:r>
+        <w:t>stressed animals! These tips are only for use in domestic situations</w:t>
+      </w:r>
+      <w:r>
+        <w:t xml:space="preserve"> with trained dogs. </w:t>
+      </w:r>
+    </w:p>
+    <w:p>
+      <w:r>
+        <w:t>“</w:t>
+      </w:r>
+      <w:r>
+        <w:t>Visible Whites of Eyes</w:t>
+      </w:r>
+    </w:p>
+    <w:p>
+      <w:r>
+        <w:lastRenderedPageBreak/>
+        <w:t xml:space="preserve">“A dog that looks ‘shocked,’ </w:t>
+      </w:r>
+      <w:r>
+        <w:t xml:space="preserve">wide-eyed, or otherwise </w:t>
+      </w:r>
+      <w:r>
+        <w:t xml:space="preserve">distinctly shrunken in the irises is likely experiencing </w:t>
+      </w:r>
+      <w:r>
+        <w:t xml:space="preserve">subtle stressors. </w:t>
+      </w:r>
+      <w:r>
+        <w:t>This is often referred to as the ‘whale eye</w:t>
+      </w:r>
+      <w:r>
+        <w:t xml:space="preserve">.’ This differs from the normal, almond-shaped </w:t>
+      </w:r>
+      <w:r>
+        <w:t>eyes of a calm dog (see fig. 1).”</w:t>
+      </w:r>
+    </w:p>
+    <w:p>
+      <w:r>
+        <w:t>[826]</w:t>
+      </w:r>
+    </w:p>
+    <w:p>
+      <w:r>
+        <w:t>2</w:t>
+      </w:r>
+    </w:p>
+    <w:p/>
+    <w:p>
+      <w:r>
+        <w:t>[</w:t>
+      </w:r>
+      <w:proofErr w:type="spellStart"/>
+      <w:r>
+        <w:t>Code_</w:t>
+      </w:r>
+      <w:r>
+        <w:t>Doc</w:t>
+      </w:r>
+      <w:proofErr w:type="spellEnd"/>
+      <w:r>
+        <w:t xml:space="preserve"> / 1 / Note with code variable]</w:t>
       </w:r>
     </w:p>
     <w:p>
@@ -227,36 +985,99 @@
           <w:i/>
           <w:iCs/>
         </w:rPr>
-        <w:t xml:space="preserve">This entry seems earlier than the front cover text. The pen is darker. </w:t>
-      </w:r>
-    </w:p>
-    <w:p>
-      <w:r>
-        <w:t>“Moon on 6</w:t>
-      </w:r>
-      <w:r>
-        <w:rPr>
-          <w:vertAlign w:val="superscript"/>
-        </w:rPr>
-        <w:t>th</w:t>
-      </w:r>
-      <w:r>
-        <w:t xml:space="preserve"> this month</w:t>
-      </w:r>
-    </w:p>
-    <w:p>
-      <w:r>
-        <w:t>“Go to store for eggs, bagels, deli meat, wheat bread</w:t>
-      </w:r>
-    </w:p>
-    <w:p>
-      <w:r>
-        <w:t>“Call Janet to sit the kids</w:t>
-      </w:r>
-    </w:p>
-    <w:p>
-      <w:r>
-        <w:t>“NEED NEW BOARDS FOR THE CABIN ASAP!!!”</w:t>
+        <w:t xml:space="preserve">Looks like a page from a magazine. </w:t>
+      </w:r>
+    </w:p>
+    <w:p>
+      <w:r>
+        <w:t xml:space="preserve">“Retrain your Brain with </w:t>
+      </w:r>
+      <w:r>
+        <w:t>5 Short Memory Exercises!</w:t>
+      </w:r>
+    </w:p>
+    <w:p>
+      <w:r>
+        <w:t>“</w:t>
+      </w:r>
+      <w:r>
+        <w:t xml:space="preserve">Number 1: </w:t>
+      </w:r>
+      <w:r>
+        <w:t>Reverse Sentences</w:t>
+      </w:r>
+    </w:p>
+    <w:p>
+      <w:r>
+        <w:t>“</w:t>
+      </w:r>
+      <w:r>
+        <w:t>It’s as simple as it sounds</w:t>
+      </w:r>
+      <w:r>
+        <w:t>!</w:t>
+      </w:r>
+      <w:r>
+        <w:t xml:space="preserve"> </w:t>
+      </w:r>
+      <w:r>
+        <w:t xml:space="preserve">Just focus on a sentence—whether from a loved one, a TV show, or other conversations—and try to recite it in reverse order. For example: If your </w:t>
+      </w:r>
+      <w:r>
+        <w:t>friend says</w:t>
+      </w:r>
+      <w:r>
+        <w:t>,</w:t>
+      </w:r>
+      <w:r>
+        <w:t xml:space="preserve"> ‘The sky is clear tonight,</w:t>
+      </w:r>
+      <w:r>
+        <w:t>’</w:t>
+      </w:r>
+      <w:r>
+        <w:t xml:space="preserve"> you would say, </w:t>
+      </w:r>
+      <w:r>
+        <w:t>‘</w:t>
+      </w:r>
+      <w:r>
+        <w:t>Tonight clear is sky the.</w:t>
+      </w:r>
+      <w:r>
+        <w:t>’</w:t>
+      </w:r>
+    </w:p>
+    <w:p>
+      <w:r>
+        <w:t>Aim to do this at least [VAR] times per day for maximum results</w:t>
+      </w:r>
+      <w:r>
+        <w:t>, including faster recall</w:t>
+      </w:r>
+      <w:r>
+        <w:t xml:space="preserve"> and</w:t>
+      </w:r>
+      <w:r>
+        <w:t xml:space="preserve"> reduction of the appearance of dementia symptoms</w:t>
+      </w:r>
+      <w:r>
+        <w:t>.”</w:t>
+      </w:r>
+    </w:p>
+    <w:p>
+      <w:pPr>
+        <w:rPr>
+          <w:i/>
+          <w:iCs/>
+        </w:rPr>
+      </w:pPr>
+      <w:r>
+        <w:rPr>
+          <w:i/>
+          <w:iCs/>
+        </w:rPr>
+        <w:t xml:space="preserve">[VAR] is circled in red. </w:t>
       </w:r>
     </w:p>
     <w:p>
@@ -264,10 +1085,7 @@
         <w:t>[</w:t>
       </w:r>
       <w:r>
-        <w:t>213</w:t>
-      </w:r>
-      <w:r>
-        <w:t>]</w:t>
+        <w:t>426]</w:t>
       </w:r>
     </w:p>
     <w:p>
@@ -278,33 +1096,80 @@
     <w:p/>
     <w:p>
       <w:r>
-        <w:t>[Diary_Doc / 4 / Interacting with “Diary” item]</w:t>
-      </w:r>
-    </w:p>
-    <w:p>
-      <w:r>
-        <w:t>“Looking into colloidal silver for my condition – might turn me blue??? &lt;- LOOK INTO THIS</w:t>
-      </w:r>
-    </w:p>
-    <w:p>
-      <w:r>
-        <w:t xml:space="preserve">“DON’T FORGET Bella’s soccer practice on Tues and Thurs again!! </w:t>
-      </w:r>
-    </w:p>
-    <w:p>
-      <w:r>
-        <w:t>“look up daycare ratings”</w:t>
-      </w:r>
-    </w:p>
-    <w:p>
-      <w:r>
         <w:t>[</w:t>
       </w:r>
-      <w:r>
-        <w:t>178</w:t>
-      </w:r>
-      <w:r>
-        <w:t>]</w:t>
+      <w:proofErr w:type="spellStart"/>
+      <w:r>
+        <w:t>Code_</w:t>
+      </w:r>
+      <w:r>
+        <w:t>Doc</w:t>
+      </w:r>
+      <w:proofErr w:type="spellEnd"/>
+      <w:r>
+        <w:t xml:space="preserve"> / 2 / Note with code variable]</w:t>
+      </w:r>
+    </w:p>
+    <w:p>
+      <w:r>
+        <w:t>“To Lucas –</w:t>
+      </w:r>
+    </w:p>
+    <w:p>
+      <w:r>
+        <w:t>“</w:t>
+      </w:r>
+      <w:r>
+        <w:t xml:space="preserve">Headed out to </w:t>
+      </w:r>
+      <w:r>
+        <w:t>the store to get a few things. Didn’t want to wake you up. The kids are coming with, don’t go crazy looking for them. (I know how you get!!)</w:t>
+      </w:r>
+      <w:r>
+        <w:t xml:space="preserve"> </w:t>
+      </w:r>
+      <w:r>
+        <w:t xml:space="preserve">If we’re not back before [VAR], THEN you can freak out, haha. </w:t>
+      </w:r>
+    </w:p>
+    <w:p>
+      <w:r>
+        <w:t>“</w:t>
+      </w:r>
+      <w:r>
+        <w:t>Love you always,</w:t>
+      </w:r>
+    </w:p>
+    <w:p>
+      <w:r>
+        <w:t>“Brigette.”</w:t>
+      </w:r>
+    </w:p>
+    <w:p>
+      <w:pPr>
+        <w:rPr>
+          <w:i/>
+          <w:iCs/>
+        </w:rPr>
+      </w:pPr>
+      <w:r>
+        <w:rPr>
+          <w:i/>
+          <w:iCs/>
+        </w:rPr>
+        <w:t>[VAR] is highlighted in bright, ne</w:t>
+      </w:r>
+      <w:r>
+        <w:rPr>
+          <w:i/>
+          <w:iCs/>
+        </w:rPr>
+        <w:t>w yellow.</w:t>
+      </w:r>
+    </w:p>
+    <w:p>
+      <w:r>
+        <w:t>[300]</w:t>
       </w:r>
     </w:p>
     <w:p>
@@ -315,36 +1180,154 @@
     <w:p/>
     <w:p>
       <w:r>
-        <w:t>[Diary_Doc / 5 / Interacting with “Diary” item]</w:t>
-      </w:r>
-    </w:p>
-    <w:p>
-      <w:r>
-        <w:t>“Boards good to go</w:t>
-      </w:r>
-    </w:p>
-    <w:p>
-      <w:r>
-        <w:t>“Janet sitting kids for 2 nights... told her I’m visiting Brigette</w:t>
-      </w:r>
-    </w:p>
-    <w:p>
-      <w:r>
-        <w:t>“visit Brigette sometime soon”</w:t>
-      </w:r>
+        <w:lastRenderedPageBreak/>
+        <w:t>[</w:t>
+      </w:r>
+      <w:proofErr w:type="spellStart"/>
+      <w:r>
+        <w:t>Code_</w:t>
+      </w:r>
+      <w:r>
+        <w:t>Doc</w:t>
+      </w:r>
+      <w:proofErr w:type="spellEnd"/>
+      <w:r>
+        <w:t xml:space="preserve"> / 3 / Note with code variable]</w:t>
+      </w:r>
+    </w:p>
+    <w:p>
+      <w:pPr>
+        <w:rPr>
+          <w:i/>
+          <w:iCs/>
+        </w:rPr>
+      </w:pPr>
+      <w:r>
+        <w:rPr>
+          <w:i/>
+          <w:iCs/>
+        </w:rPr>
+        <w:t>This handwriting is difficult to decipher</w:t>
+      </w:r>
+      <w:r>
+        <w:rPr>
+          <w:i/>
+          <w:iCs/>
+        </w:rPr>
+        <w:t>...</w:t>
+      </w:r>
+    </w:p>
+    <w:p>
+      <w:r>
+        <w:t>“HAP E FATHERS DAY!!</w:t>
+      </w:r>
+    </w:p>
+    <w:p>
+      <w:r>
+        <w:t>“</w:t>
+      </w:r>
+      <w:proofErr w:type="spellStart"/>
+      <w:r>
+        <w:t>mE</w:t>
+      </w:r>
+      <w:proofErr w:type="spellEnd"/>
+      <w:r>
+        <w:t xml:space="preserve"> and </w:t>
+      </w:r>
+      <w:r>
+        <w:t xml:space="preserve">mom are </w:t>
+      </w:r>
+      <w:proofErr w:type="spellStart"/>
+      <w:r>
+        <w:t>mising</w:t>
+      </w:r>
+      <w:proofErr w:type="spellEnd"/>
+      <w:r>
+        <w:t xml:space="preserve"> you</w:t>
+      </w:r>
+    </w:p>
+    <w:p>
+      <w:r>
+        <w:t xml:space="preserve">“She told me to put this drawing I did at </w:t>
+      </w:r>
+      <w:proofErr w:type="spellStart"/>
+      <w:r>
+        <w:t>skool</w:t>
+      </w:r>
+      <w:proofErr w:type="spellEnd"/>
+      <w:r>
+        <w:t xml:space="preserve"> in here for you to see</w:t>
+      </w:r>
+      <w:r>
+        <w:t xml:space="preserve"> but I wanted to do another one JUST FOR YOU!!</w:t>
+      </w:r>
+    </w:p>
+    <w:p>
+      <w:r>
+        <w:t>“</w:t>
+      </w:r>
+      <w:r>
+        <w:t xml:space="preserve">I am doing good but I am sad some time at </w:t>
+      </w:r>
+      <w:proofErr w:type="spellStart"/>
+      <w:r>
+        <w:t>skool</w:t>
+      </w:r>
+      <w:proofErr w:type="spellEnd"/>
       <w:r>
         <w:t xml:space="preserve"> </w:t>
       </w:r>
+      <w:proofErr w:type="spellStart"/>
+      <w:r>
+        <w:t>becaz</w:t>
+      </w:r>
+      <w:proofErr w:type="spellEnd"/>
+      <w:r>
+        <w:t xml:space="preserve"> they had </w:t>
+      </w:r>
+      <w:proofErr w:type="gramStart"/>
+      <w:r>
+        <w:t>bring</w:t>
+      </w:r>
+      <w:proofErr w:type="gramEnd"/>
+      <w:r>
+        <w:t xml:space="preserve"> your parent day and you could not come</w:t>
+      </w:r>
+      <w:r>
+        <w:t xml:space="preserve"> so I am glad it is only [VAR] more days until you come </w:t>
+      </w:r>
+    </w:p>
+    <w:p>
+      <w:r>
+        <w:t>“</w:t>
+      </w:r>
+      <w:r>
+        <w:t xml:space="preserve">Okay bye </w:t>
+      </w:r>
+    </w:p>
+    <w:p>
+      <w:r>
+        <w:t>“</w:t>
+      </w:r>
+      <w:r>
+        <w:t>FROM BELLA”</w:t>
+      </w:r>
+    </w:p>
+    <w:p>
+      <w:r>
+        <w:rPr>
+          <w:i/>
+          <w:iCs/>
+        </w:rPr>
+        <w:t xml:space="preserve">There is a faded green star stamped over [VAR]. </w:t>
+      </w:r>
     </w:p>
     <w:p>
       <w:r>
         <w:t>[</w:t>
       </w:r>
       <w:r>
-        <w:t>115</w:t>
-      </w:r>
-      <w:r>
-        <w:t>]</w:t>
+        <w:t>440]</w:t>
       </w:r>
     </w:p>
     <w:p>
@@ -355,806 +1338,18 @@
     <w:p/>
     <w:p>
       <w:r>
-        <w:t>[Diary_Doc / 6 / Interacting with “Diary” item]</w:t>
-      </w:r>
-    </w:p>
-    <w:p>
-      <w:pPr>
-        <w:rPr>
-          <w:i/>
-          <w:iCs/>
-        </w:rPr>
-      </w:pPr>
-      <w:r>
-        <w:rPr>
-          <w:i/>
-          <w:iCs/>
-        </w:rPr>
-        <w:t xml:space="preserve">There’s a lot of pages torn out after this. </w:t>
-      </w:r>
-    </w:p>
-    <w:p>
-      <w:r>
-        <w:t>“Moon on the 18</w:t>
-      </w:r>
-      <w:r>
-        <w:rPr>
-          <w:vertAlign w:val="superscript"/>
-        </w:rPr>
-        <w:t>th</w:t>
-      </w:r>
-      <w:r>
-        <w:t xml:space="preserve"> this month</w:t>
-      </w:r>
-    </w:p>
-    <w:p>
-      <w:r>
-        <w:lastRenderedPageBreak/>
-        <w:t>“Moon on the 18</w:t>
-      </w:r>
-      <w:r>
-        <w:rPr>
-          <w:vertAlign w:val="superscript"/>
-        </w:rPr>
-        <w:t>th</w:t>
-      </w:r>
-      <w:r>
-        <w:t xml:space="preserve"> this month</w:t>
-      </w:r>
-    </w:p>
-    <w:p>
-      <w:r>
-        <w:t xml:space="preserve">“I dont like the way this new treatmnt makes me feel with all these </w:t>
-      </w:r>
-      <w:r>
-        <w:t xml:space="preserve">mushrooms and tonics and I honestly don’t think its getting any better </w:t>
-      </w:r>
-    </w:p>
-    <w:p>
-      <w:r>
-        <w:t>“my head gets so spinny all the days before the moon and its getting hard to remember any of the things I have to do</w:t>
-      </w:r>
-    </w:p>
-    <w:p>
-      <w:r>
-        <w:t>“Brigette looked me in the eyes and asked me where her dad gone and i don’t remember who her dad is or how she got in my house until I did”</w:t>
-      </w:r>
-    </w:p>
-    <w:p>
-      <w:r>
         <w:t>[</w:t>
       </w:r>
-      <w:r>
-        <w:t>494]</w:t>
-      </w:r>
-    </w:p>
-    <w:p>
-      <w:r>
-        <w:t>1</w:t>
-      </w:r>
-    </w:p>
-    <w:p/>
-    <w:p>
-      <w:r>
-        <w:t>[Diary_Doc / 7 / Interacting with “Diary” item]</w:t>
-      </w:r>
-    </w:p>
-    <w:p>
-      <w:r>
-        <w:t>“Get milk, yogurt at store</w:t>
-      </w:r>
-    </w:p>
-    <w:p>
-      <w:r>
-        <w:t>“Get more ginseng at that market... seems to help with the memory loss</w:t>
-      </w:r>
-    </w:p>
-    <w:p>
-      <w:r>
-        <w:t>“Find Brigette’s obit”</w:t>
-      </w:r>
-    </w:p>
-    <w:p>
-      <w:r>
-        <w:t>[</w:t>
-      </w:r>
-      <w:r>
-        <w:t>118</w:t>
-      </w:r>
-      <w:r>
-        <w:t>]</w:t>
-      </w:r>
-    </w:p>
-    <w:p>
-      <w:r>
-        <w:t>1</w:t>
-      </w:r>
-    </w:p>
-    <w:p/>
-    <w:p>
-      <w:r>
-        <w:t>[Diary_Doc / 8 / Interacting with “Diary” item]</w:t>
-      </w:r>
-    </w:p>
-    <w:p>
-      <w:r>
-        <w:t>“More boards for cabin</w:t>
-      </w:r>
-    </w:p>
-    <w:p>
-      <w:r>
-        <w:t>“Ask Janet if she can take the kids for a couple weeks</w:t>
-      </w:r>
-    </w:p>
-    <w:p>
-      <w:r>
-        <w:t xml:space="preserve">“SYDNEY and BELLA SYDNEY </w:t>
-      </w:r>
-      <w:r>
-        <w:tab/>
-        <w:t>and BELLA  and SYNDEY BELL</w:t>
-      </w:r>
-    </w:p>
-    <w:p>
-      <w:r>
-        <w:t>“On the phone you will say: Hello Janet I hope you’re having a good evening would you mind taking Syndey and Bela for a little while I need to figure out how Brigette died for a bit and then I’ll be fine until next month when it will happen again and I’m sorry it happens again</w:t>
-      </w:r>
-    </w:p>
-    <w:p>
-      <w:r>
-        <w:t>“DON’T FORGET”</w:t>
-      </w:r>
-    </w:p>
-    <w:p>
-      <w:r>
-        <w:t>[</w:t>
-      </w:r>
-      <w:r>
-        <w:t>419</w:t>
-      </w:r>
-      <w:r>
-        <w:t>]</w:t>
-      </w:r>
-    </w:p>
-    <w:p>
-      <w:r>
-        <w:t>1</w:t>
-      </w:r>
-    </w:p>
-    <w:p/>
-    <w:p>
-      <w:r>
-        <w:t>[Diary_Doc / 9 / Interacting with “Diary” item]</w:t>
-      </w:r>
-    </w:p>
-    <w:p>
-      <w:pPr>
-        <w:rPr>
-          <w:i/>
-          <w:iCs/>
-        </w:rPr>
-      </w:pPr>
-      <w:r>
-        <w:rPr>
-          <w:i/>
-          <w:iCs/>
-        </w:rPr>
-        <w:lastRenderedPageBreak/>
-        <w:t>More missing pages.</w:t>
-      </w:r>
-    </w:p>
-    <w:p>
-      <w:r>
-        <w:t>“I am so lonely in here and so restless</w:t>
-      </w:r>
-    </w:p>
-    <w:p>
-      <w:r>
-        <w:t>“There is no one on the outside of here I have boarded myself in like the allegory of the cave and I wonder if the world is more scared of me or I of IT!!!</w:t>
-      </w:r>
-    </w:p>
-    <w:p>
-      <w:r>
-        <w:t>“I see under my hands a very familiar woman and I am looking down at her through a fisheye and she is stretching and her mouth is pulling out and open like drowning above air and I realize it’s just the hammer as I nail another board but my hands are still around its neeeeck</w:t>
-      </w:r>
-    </w:p>
-    <w:p>
-      <w:r>
-        <w:t>“visit brigette soon”</w:t>
-      </w:r>
-    </w:p>
-    <w:p>
-      <w:r>
-        <w:t>[</w:t>
-      </w:r>
-      <w:r>
-        <w:t>509</w:t>
-      </w:r>
-      <w:r>
-        <w:t>]</w:t>
-      </w:r>
-    </w:p>
-    <w:p>
-      <w:r>
-        <w:t>1</w:t>
-      </w:r>
-    </w:p>
-    <w:p/>
-    <w:p>
-      <w:r>
-        <w:t>[Diary_Doc / 10 / Interacting with “Diary” item]</w:t>
-      </w:r>
-    </w:p>
-    <w:p>
-      <w:r>
-        <w:t>“Moon tonite moon tonite moon</w:t>
-      </w:r>
-    </w:p>
-    <w:p>
-      <w:r>
-        <w:t xml:space="preserve">“there is something I need in the cabinet shiny silver glinting </w:t>
-      </w:r>
-      <w:r>
-        <w:t>red blue yellow green</w:t>
-      </w:r>
-    </w:p>
-    <w:p>
-      <w:r>
-        <w:t>“the beam will hit and I will be whole again”</w:t>
-      </w:r>
-    </w:p>
-    <w:p>
-      <w:r>
-        <w:t>[</w:t>
-      </w:r>
-      <w:r>
-        <w:t>149</w:t>
-      </w:r>
-      <w:r>
-        <w:t>]</w:t>
-      </w:r>
-    </w:p>
-    <w:p>
-      <w:r>
-        <w:t>1</w:t>
-      </w:r>
-    </w:p>
-    <w:p/>
-    <w:p>
-      <w:r>
-        <w:t xml:space="preserve">[Newspaper_Doc / </w:t>
-      </w:r>
-      <w:r>
-        <w:t>Page</w:t>
-      </w:r>
-      <w:r>
-        <w:t xml:space="preserve"> in </w:t>
-      </w:r>
-      <w:r>
-        <w:t>e</w:t>
-      </w:r>
-      <w:r>
-        <w:t>nvironment]</w:t>
-      </w:r>
-    </w:p>
-    <w:p>
-      <w:r>
-        <w:t>“Sudden death of local woman reignites coyote fears</w:t>
-      </w:r>
-    </w:p>
-    <w:p>
-      <w:r>
-        <w:t xml:space="preserve">“Local dog groomer Brigette Morgan was found dead early Monday morning after a search party uncovered her body in Sawyer Creek. </w:t>
-      </w:r>
-      <w:r>
-        <w:t>Authorities at the scene say that she was found, ‘With her throat ripped out, like some animal had done it.’</w:t>
-      </w:r>
-    </w:p>
-    <w:p>
-      <w:r>
-        <w:t>“In an official statement, Police Chief Arthur Van Holt added, ‘Our forensics analysts pinned down, without a doubt, a bite radius that suggests a big-muzzled animal, coyote, somethin [sic] like that. It’s a horrible tragedy that reminds all of us to keep an eye on our dogs, keep an eye on our kids, keep out the way of nature and keep on keepin [sic] on with our own human business. Our hearts are with Miss Morgan’s family.’</w:t>
-      </w:r>
-    </w:p>
-    <w:p>
-      <w:r>
-        <w:t xml:space="preserve">“Morgan is survived by her husband, Lucas Morgan, and her two children, Bella and Sydney Morgan. </w:t>
-      </w:r>
-    </w:p>
-    <w:p>
-      <w:r>
-        <w:t>“’She was a pillar of the community,’ says Tanya Stone, Morgan’s apprentice. ‘Everybody knew she was just as compassionate to people as she was to animals.’”</w:t>
-      </w:r>
-    </w:p>
-    <w:p>
-      <w:r>
-        <w:lastRenderedPageBreak/>
-        <w:t>[968]</w:t>
-      </w:r>
-    </w:p>
-    <w:p>
-      <w:r>
-        <w:t>2</w:t>
-      </w:r>
-    </w:p>
-    <w:p/>
-    <w:p>
-      <w:r>
-        <w:t>[BookPage_Doc / Page in environment]</w:t>
-      </w:r>
-    </w:p>
-    <w:p>
-      <w:r>
-        <w:rPr>
-          <w:lang w:val="de-DE"/>
-        </w:rPr>
-        <w:t>„Der Wolfsmensch (oder, immer beliebter, der ‚Werwolf‘) besitzt eine unvergleichliche Physiologie – nicht nur dehnt sich die Muskulatur, um das Wachstum von Schnauze, Ohren und zusätzlichen Gelenken zu ermöglichen, sondern wir können auch von der Entwicklung temporärer Knochen ausgehen.“</w:t>
-      </w:r>
-    </w:p>
-    <w:p>
-      <w:r>
-        <w:t>[288]</w:t>
-      </w:r>
-    </w:p>
-    <w:p>
-      <w:r>
-        <w:t>2</w:t>
-      </w:r>
-    </w:p>
-    <w:p/>
-    <w:p>
-      <w:r>
-        <w:t>[Magazine</w:t>
-      </w:r>
-      <w:r>
-        <w:t>_Doc / Page in environment]</w:t>
-      </w:r>
-    </w:p>
-    <w:p>
-      <w:r>
-        <w:t>“Common Signs of Scared Dogs</w:t>
-      </w:r>
-    </w:p>
-    <w:p>
-      <w:r>
-        <w:t>“</w:t>
-      </w:r>
-      <w:r>
-        <w:t xml:space="preserve">Though ascribed often to anger, the number one cause of </w:t>
-      </w:r>
-      <w:r>
-        <w:t xml:space="preserve">dog bites is actually fear. </w:t>
-      </w:r>
-      <w:r>
-        <w:t>But d</w:t>
-      </w:r>
-      <w:r>
-        <w:t>istinguishing fear from excitement can be incredibly difficult for the average dog owner</w:t>
-      </w:r>
-      <w:r>
-        <w:t xml:space="preserve">... and that’s where our short guide comes in! </w:t>
-      </w:r>
-      <w:r>
-        <w:t xml:space="preserve">Learning to recognize scared dogs </w:t>
-      </w:r>
-      <w:r>
-        <w:t xml:space="preserve">ensures </w:t>
-      </w:r>
-      <w:r>
-        <w:t xml:space="preserve">not only </w:t>
-      </w:r>
-      <w:r>
-        <w:t xml:space="preserve">the safety of your own pets, but young children, the elderly, and those inexperienced with animals. </w:t>
-      </w:r>
-    </w:p>
-    <w:p>
-      <w:r>
-        <w:t>“</w:t>
-      </w:r>
-      <w:r>
-        <w:t xml:space="preserve">DO NOT use these tips to approach wild or otherwise </w:t>
-      </w:r>
-      <w:r>
-        <w:t xml:space="preserve">highly </w:t>
-      </w:r>
-      <w:r>
-        <w:t>stressed animals! These tips are only for use in domestic situations</w:t>
-      </w:r>
-      <w:r>
-        <w:t xml:space="preserve"> with trained dogs. </w:t>
-      </w:r>
-    </w:p>
-    <w:p>
-      <w:r>
-        <w:t>“</w:t>
-      </w:r>
-      <w:r>
-        <w:t>Visible Whites of Eyes</w:t>
-      </w:r>
-    </w:p>
-    <w:p>
-      <w:r>
-        <w:t xml:space="preserve">“A dog that looks ‘shocked,’ </w:t>
-      </w:r>
-      <w:r>
-        <w:t xml:space="preserve">wide-eyed, or otherwise </w:t>
-      </w:r>
-      <w:r>
-        <w:t xml:space="preserve">distinctly shrunken in the irises is likely experiencing </w:t>
-      </w:r>
-      <w:r>
-        <w:t xml:space="preserve">subtle stressors. </w:t>
-      </w:r>
-      <w:r>
-        <w:t>This is often referred to as the ‘whale eye</w:t>
-      </w:r>
-      <w:r>
-        <w:t xml:space="preserve">.’ This differs from the normal, almond-shaped </w:t>
-      </w:r>
-      <w:r>
-        <w:t>eyes of a calm dog (see fig. 1).”</w:t>
-      </w:r>
-    </w:p>
-    <w:p>
-      <w:r>
-        <w:t>[826]</w:t>
-      </w:r>
-    </w:p>
-    <w:p>
-      <w:r>
-        <w:t>2</w:t>
-      </w:r>
-    </w:p>
-    <w:p/>
-    <w:p>
-      <w:r>
-        <w:t>[</w:t>
-      </w:r>
+      <w:proofErr w:type="spellStart"/>
       <w:r>
         <w:t>Code_</w:t>
       </w:r>
       <w:r>
         <w:t>Doc</w:t>
       </w:r>
-      <w:r>
-        <w:t xml:space="preserve"> / 1 / Note with code variable]</w:t>
-      </w:r>
-    </w:p>
-    <w:p>
-      <w:pPr>
-        <w:rPr>
-          <w:i/>
-          <w:iCs/>
-        </w:rPr>
-      </w:pPr>
-      <w:r>
-        <w:rPr>
-          <w:i/>
-          <w:iCs/>
-        </w:rPr>
-        <w:t xml:space="preserve">Looks like a page from a magazine. </w:t>
-      </w:r>
-    </w:p>
-    <w:p>
-      <w:r>
-        <w:t xml:space="preserve">“Retrain your Brain with </w:t>
-      </w:r>
-      <w:r>
-        <w:t>5 Short Memory Exercises!</w:t>
-      </w:r>
-    </w:p>
-    <w:p>
-      <w:r>
-        <w:t>“</w:t>
-      </w:r>
-      <w:r>
-        <w:t xml:space="preserve">Number 1: </w:t>
-      </w:r>
-      <w:r>
-        <w:t>Reverse Sentences</w:t>
-      </w:r>
-    </w:p>
-    <w:p>
-      <w:r>
-        <w:lastRenderedPageBreak/>
-        <w:t>“</w:t>
-      </w:r>
-      <w:r>
-        <w:t>It’s as simple as it sounds</w:t>
-      </w:r>
-      <w:r>
-        <w:t>!</w:t>
-      </w:r>
-      <w:r>
-        <w:t xml:space="preserve"> </w:t>
-      </w:r>
-      <w:r>
-        <w:t xml:space="preserve">Just focus on a sentence—whether from a loved one, a TV show, or other conversations—and try to recite it in reverse order. For example: If your </w:t>
-      </w:r>
-      <w:r>
-        <w:t>friend says</w:t>
-      </w:r>
-      <w:r>
-        <w:t>,</w:t>
-      </w:r>
-      <w:r>
-        <w:t xml:space="preserve"> ‘The sky is clear tonight,</w:t>
-      </w:r>
-      <w:r>
-        <w:t>’</w:t>
-      </w:r>
-      <w:r>
-        <w:t xml:space="preserve"> you would say, </w:t>
-      </w:r>
-      <w:r>
-        <w:t>‘</w:t>
-      </w:r>
-      <w:r>
-        <w:t>Tonight clear is sky the.</w:t>
-      </w:r>
-      <w:r>
-        <w:t>’</w:t>
-      </w:r>
-    </w:p>
-    <w:p>
-      <w:r>
-        <w:t>Aim to do this at least [VAR] times per day for maximum results</w:t>
-      </w:r>
-      <w:r>
-        <w:t>, including faster recall</w:t>
-      </w:r>
-      <w:r>
-        <w:t xml:space="preserve"> and</w:t>
-      </w:r>
-      <w:r>
-        <w:t xml:space="preserve"> reduction of the appearance of dementia symptoms</w:t>
-      </w:r>
-      <w:r>
-        <w:t>.”</w:t>
-      </w:r>
-    </w:p>
-    <w:p>
-      <w:pPr>
-        <w:rPr>
-          <w:i/>
-          <w:iCs/>
-        </w:rPr>
-      </w:pPr>
-      <w:r>
-        <w:rPr>
-          <w:i/>
-          <w:iCs/>
-        </w:rPr>
-        <w:t xml:space="preserve">[VAR] is circled in red. </w:t>
-      </w:r>
-    </w:p>
-    <w:p>
-      <w:r>
-        <w:t>[</w:t>
-      </w:r>
-      <w:r>
-        <w:t>426]</w:t>
-      </w:r>
-    </w:p>
-    <w:p>
-      <w:r>
-        <w:t>1</w:t>
-      </w:r>
-    </w:p>
-    <w:p/>
-    <w:p>
-      <w:r>
-        <w:t>[Code_</w:t>
-      </w:r>
-      <w:r>
-        <w:t>Doc</w:t>
-      </w:r>
-      <w:r>
-        <w:t xml:space="preserve"> / </w:t>
-      </w:r>
-      <w:r>
-        <w:t>2</w:t>
-      </w:r>
-      <w:r>
-        <w:t xml:space="preserve"> / Note with code variable]</w:t>
-      </w:r>
-    </w:p>
-    <w:p>
-      <w:r>
-        <w:t>“To Lucas –</w:t>
-      </w:r>
-    </w:p>
-    <w:p>
-      <w:r>
-        <w:t>“</w:t>
-      </w:r>
-      <w:r>
-        <w:t xml:space="preserve">Headed out to </w:t>
-      </w:r>
-      <w:r>
-        <w:t>the store to get a few things. Didn’t want to wake you up. The kids are coming with, don’t go crazy looking for them. (I know how you get!!)</w:t>
-      </w:r>
-      <w:r>
-        <w:t xml:space="preserve"> </w:t>
-      </w:r>
-      <w:r>
-        <w:t xml:space="preserve">If we’re not back before [VAR], THEN you can freak out, haha. </w:t>
-      </w:r>
-    </w:p>
-    <w:p>
-      <w:r>
-        <w:t>“</w:t>
-      </w:r>
-      <w:r>
-        <w:t>Love you always,</w:t>
-      </w:r>
-    </w:p>
-    <w:p>
-      <w:r>
-        <w:t>“Brigette.”</w:t>
-      </w:r>
-    </w:p>
-    <w:p>
-      <w:pPr>
-        <w:rPr>
-          <w:i/>
-          <w:iCs/>
-        </w:rPr>
-      </w:pPr>
-      <w:r>
-        <w:rPr>
-          <w:i/>
-          <w:iCs/>
-        </w:rPr>
-        <w:t>[VAR] is highlighted in bright, ne</w:t>
-      </w:r>
-      <w:r>
-        <w:rPr>
-          <w:i/>
-          <w:iCs/>
-        </w:rPr>
-        <w:t>w yellow.</w:t>
-      </w:r>
-    </w:p>
-    <w:p>
-      <w:r>
-        <w:t>[300]</w:t>
-      </w:r>
-    </w:p>
-    <w:p>
-      <w:r>
-        <w:t>1</w:t>
-      </w:r>
-    </w:p>
-    <w:p/>
-    <w:p>
-      <w:r>
-        <w:t>[Code_</w:t>
-      </w:r>
-      <w:r>
-        <w:t>Doc</w:t>
-      </w:r>
-      <w:r>
-        <w:t xml:space="preserve"> / </w:t>
-      </w:r>
-      <w:r>
-        <w:t>3</w:t>
-      </w:r>
-      <w:r>
-        <w:t xml:space="preserve"> / Note with code variable]</w:t>
-      </w:r>
-    </w:p>
-    <w:p>
-      <w:pPr>
-        <w:rPr>
-          <w:i/>
-          <w:iCs/>
-        </w:rPr>
-      </w:pPr>
-      <w:r>
-        <w:rPr>
-          <w:i/>
-          <w:iCs/>
-        </w:rPr>
-        <w:t>This handwriting is difficult to decipher</w:t>
-      </w:r>
-      <w:r>
-        <w:rPr>
-          <w:i/>
-          <w:iCs/>
-        </w:rPr>
-        <w:t>...</w:t>
-      </w:r>
-    </w:p>
-    <w:p>
-      <w:r>
-        <w:t>“HAP E FATHERS DAY!!</w:t>
-      </w:r>
-    </w:p>
-    <w:p>
-      <w:r>
-        <w:t xml:space="preserve">“mE and </w:t>
-      </w:r>
-      <w:r>
-        <w:t>mom are mising you</w:t>
-      </w:r>
-    </w:p>
-    <w:p>
-      <w:r>
-        <w:t>“She told me to put this drawing I did at skool in here for you to see</w:t>
-      </w:r>
-      <w:r>
-        <w:t xml:space="preserve"> but I wanted to do another one JUST FOR YOU!!</w:t>
-      </w:r>
-    </w:p>
-    <w:p>
-      <w:r>
-        <w:t>“</w:t>
-      </w:r>
-      <w:r>
-        <w:t xml:space="preserve">I am doing good but I am sad some time at skool </w:t>
-      </w:r>
-      <w:r>
-        <w:t>becaz they had bring your parent day and you could not come</w:t>
-      </w:r>
-      <w:r>
-        <w:t xml:space="preserve"> so I am glad it is only [VAR] more days until you come </w:t>
-      </w:r>
-    </w:p>
-    <w:p>
-      <w:r>
-        <w:t>“</w:t>
-      </w:r>
-      <w:r>
-        <w:t xml:space="preserve">Okay bye </w:t>
-      </w:r>
-    </w:p>
-    <w:p>
-      <w:r>
-        <w:t>“</w:t>
-      </w:r>
-      <w:r>
-        <w:t>FROM BELLA”</w:t>
-      </w:r>
-    </w:p>
-    <w:p>
-      <w:r>
-        <w:rPr>
-          <w:i/>
-          <w:iCs/>
-        </w:rPr>
-        <w:lastRenderedPageBreak/>
-        <w:t xml:space="preserve">There is a faded green star stamped over [VAR]. </w:t>
-      </w:r>
-    </w:p>
-    <w:p>
-      <w:r>
-        <w:t>[</w:t>
-      </w:r>
-      <w:r>
-        <w:t>440]</w:t>
-      </w:r>
-    </w:p>
-    <w:p>
-      <w:r>
-        <w:t>1</w:t>
-      </w:r>
-    </w:p>
-    <w:p/>
-    <w:p>
-      <w:r>
-        <w:t>[Code_</w:t>
-      </w:r>
-      <w:r>
-        <w:t>Doc</w:t>
-      </w:r>
-      <w:r>
-        <w:t xml:space="preserve"> / </w:t>
-      </w:r>
-      <w:r>
-        <w:t>4</w:t>
-      </w:r>
-      <w:r>
-        <w:t xml:space="preserve"> / Note with code variable]</w:t>
+      <w:proofErr w:type="spellEnd"/>
+      <w:r>
+        <w:t xml:space="preserve"> / 4 / Note with code variable]</w:t>
       </w:r>
     </w:p>
     <w:p>
@@ -1287,8 +1482,13 @@
       <w:r>
         <w:t>[</w:t>
       </w:r>
-      <w:r>
-        <w:t>Timer_Interact / Interacting with hole in ceiling]</w:t>
+      <w:proofErr w:type="spellStart"/>
+      <w:r>
+        <w:t>Timer_Interact</w:t>
+      </w:r>
+      <w:proofErr w:type="spellEnd"/>
+      <w:r>
+        <w:t xml:space="preserve"> / Interacting with hole in ceiling]</w:t>
       </w:r>
     </w:p>
     <w:p>
@@ -1335,7 +1535,15 @@
     </w:p>
     <w:p>
       <w:r>
-        <w:t>[Diary_Interact / Interacting with “Diary” item for first time]</w:t>
+        <w:t>[</w:t>
+      </w:r>
+      <w:proofErr w:type="spellStart"/>
+      <w:r>
+        <w:t>Diary_Interact</w:t>
+      </w:r>
+      <w:proofErr w:type="spellEnd"/>
+      <w:r>
+        <w:t xml:space="preserve"> / Interacting with “Diary” item for first time]</w:t>
       </w:r>
     </w:p>
     <w:p>
@@ -1350,24 +1558,243 @@
           <w:i/>
           <w:iCs/>
         </w:rPr>
+        <w:t xml:space="preserve">A worn notebook. Looks like most of the pages have been ripped out... but there’s still a few hanging on. </w:t>
+      </w:r>
+    </w:p>
+    <w:p>
+      <w:r>
+        <w:t>[106]</w:t>
+      </w:r>
+    </w:p>
+    <w:p>
+      <w:r>
+        <w:t>3</w:t>
+      </w:r>
+    </w:p>
+    <w:p/>
+    <w:p>
+      <w:r>
+        <w:t>[</w:t>
+      </w:r>
+      <w:proofErr w:type="spellStart"/>
+      <w:r>
+        <w:t>Safe_Interact</w:t>
+      </w:r>
+      <w:proofErr w:type="spellEnd"/>
+      <w:r>
+        <w:t xml:space="preserve"> / Interacting with “Safe” item for first time]</w:t>
+      </w:r>
+    </w:p>
+    <w:p>
+      <w:pPr>
+        <w:rPr>
+          <w:i/>
+          <w:iCs/>
+        </w:rPr>
+      </w:pPr>
+      <w:r>
+        <w:rPr>
+          <w:i/>
+          <w:iCs/>
+        </w:rPr>
+        <w:t xml:space="preserve">This safe takes a four-digit code. </w:t>
+      </w:r>
+    </w:p>
+    <w:p>
+      <w:pPr>
+        <w:rPr>
+          <w:i/>
+          <w:iCs/>
+        </w:rPr>
+      </w:pPr>
+      <w:r>
+        <w:rPr>
+          <w:i/>
+          <w:iCs/>
+        </w:rPr>
+        <w:t>No way to figure it out through the scratches on the dials... but maybe you can find the code some other way.</w:t>
+      </w:r>
+    </w:p>
+    <w:p>
+      <w:r>
+        <w:t>[144]</w:t>
+      </w:r>
+    </w:p>
+    <w:p>
+      <w:r>
+        <w:t>2</w:t>
+      </w:r>
+    </w:p>
+    <w:p>
+      <w:pPr>
+        <w:rPr>
+          <w:i/>
+          <w:iCs/>
+        </w:rPr>
+      </w:pPr>
+    </w:p>
+    <w:p>
+      <w:r>
+        <w:t>[</w:t>
+      </w:r>
+      <w:proofErr w:type="spellStart"/>
+      <w:r>
+        <w:t>Safe_Pass</w:t>
+      </w:r>
+      <w:proofErr w:type="spellEnd"/>
+      <w:r>
+        <w:t xml:space="preserve"> / Inputting correct code into “Safe”]</w:t>
+      </w:r>
+    </w:p>
+    <w:p>
+      <w:pPr>
+        <w:rPr>
+          <w:i/>
+          <w:iCs/>
+        </w:rPr>
+      </w:pPr>
+      <w:r>
+        <w:rPr>
+          <w:i/>
+          <w:iCs/>
+        </w:rPr>
+        <w:t>You have a feeling that if you take the gun, this will all be over.</w:t>
+      </w:r>
+    </w:p>
+    <w:p>
+      <w:pPr>
+        <w:rPr>
+          <w:i/>
+          <w:iCs/>
+        </w:rPr>
+      </w:pPr>
+      <w:r>
+        <w:rPr>
+          <w:i/>
+          <w:iCs/>
+        </w:rPr>
+        <w:t>Or...</w:t>
+      </w:r>
+    </w:p>
+    <w:p>
+      <w:r>
+        <w:t>[72]</w:t>
+      </w:r>
+    </w:p>
+    <w:p>
+      <w:r>
+        <w:t>1</w:t>
+      </w:r>
+    </w:p>
+    <w:p>
+      <w:pPr>
+        <w:rPr>
+          <w:i/>
+          <w:iCs/>
+        </w:rPr>
+      </w:pPr>
+    </w:p>
+    <w:p>
+      <w:r>
+        <w:t>[</w:t>
+      </w:r>
+      <w:proofErr w:type="spellStart"/>
+      <w:r>
+        <w:t>Lab_Interact</w:t>
+      </w:r>
+      <w:proofErr w:type="spellEnd"/>
+      <w:r>
+        <w:t xml:space="preserve"> / Interacting with “Lab Equipment” for the first time]</w:t>
+      </w:r>
+    </w:p>
+    <w:p>
+      <w:pPr>
+        <w:rPr>
+          <w:i/>
+          <w:iCs/>
+        </w:rPr>
+      </w:pPr>
+      <w:r>
+        <w:rPr>
+          <w:i/>
+          <w:iCs/>
+        </w:rPr>
         <w:lastRenderedPageBreak/>
-        <w:t xml:space="preserve">A worn notebook. Looks like most of the pages have been ripped out... but there’s still a few hanging on. </w:t>
-      </w:r>
-    </w:p>
-    <w:p>
-      <w:r>
-        <w:t>[106]</w:t>
-      </w:r>
-    </w:p>
-    <w:p>
-      <w:r>
-        <w:t>3</w:t>
+        <w:t xml:space="preserve">There’s some sort of cobbled-together mechanism here. </w:t>
+      </w:r>
+    </w:p>
+    <w:p>
+      <w:pPr>
+        <w:rPr>
+          <w:i/>
+          <w:iCs/>
+        </w:rPr>
+      </w:pPr>
+      <w:r>
+        <w:rPr>
+          <w:i/>
+          <w:iCs/>
+        </w:rPr>
+        <w:t>Something about the construction tells you that if you just put the ingredients in one end, that tube will spit them out in liquid form.</w:t>
+      </w:r>
+    </w:p>
+    <w:p>
+      <w:pPr>
+        <w:rPr>
+          <w:i/>
+          <w:iCs/>
+        </w:rPr>
+      </w:pPr>
+      <w:r>
+        <w:rPr>
+          <w:i/>
+          <w:iCs/>
+        </w:rPr>
+        <w:t xml:space="preserve">You wonder what </w:t>
+      </w:r>
+      <w:r>
+        <w:rPr>
+          <w:i/>
+          <w:iCs/>
+        </w:rPr>
+        <w:t>the man</w:t>
+      </w:r>
+      <w:r>
+        <w:rPr>
+          <w:i/>
+          <w:iCs/>
+        </w:rPr>
+        <w:t xml:space="preserve"> could possibly need something like this for.  </w:t>
+      </w:r>
+    </w:p>
+    <w:p>
+      <w:r>
+        <w:t>[255]</w:t>
+      </w:r>
+    </w:p>
+    <w:p>
+      <w:pPr>
+        <w:rPr>
+          <w:i/>
+          <w:iCs/>
+        </w:rPr>
+      </w:pPr>
+      <w:r>
+        <w:t>2</w:t>
       </w:r>
     </w:p>
     <w:p/>
     <w:p>
       <w:r>
-        <w:t>[Safe_Interact / Interacting with “Safe” item for first time]</w:t>
+        <w:t>[</w:t>
+      </w:r>
+      <w:proofErr w:type="spellStart"/>
+      <w:r>
+        <w:t>Lab_Fail</w:t>
+      </w:r>
+      <w:proofErr w:type="spellEnd"/>
+      <w:r>
+        <w:t xml:space="preserve"> / Wrong final cure]</w:t>
       </w:r>
     </w:p>
     <w:p>
@@ -1382,80 +1809,33 @@
           <w:i/>
           <w:iCs/>
         </w:rPr>
-        <w:t xml:space="preserve">This safe takes a four-digit code. </w:t>
-      </w:r>
-    </w:p>
-    <w:p>
-      <w:pPr>
-        <w:rPr>
-          <w:i/>
-          <w:iCs/>
-        </w:rPr>
-      </w:pPr>
-      <w:r>
-        <w:rPr>
-          <w:i/>
-          <w:iCs/>
-        </w:rPr>
-        <w:t>No way to figure it out through the scratches on the dials... but maybe you can find the code some other way.</w:t>
-      </w:r>
-    </w:p>
-    <w:p>
-      <w:r>
-        <w:t>[144]</w:t>
-      </w:r>
-    </w:p>
-    <w:p>
-      <w:r>
-        <w:t>2</w:t>
-      </w:r>
-    </w:p>
-    <w:p>
-      <w:pPr>
-        <w:rPr>
-          <w:i/>
-          <w:iCs/>
-        </w:rPr>
-      </w:pPr>
-    </w:p>
-    <w:p>
-      <w:r>
-        <w:t>[Safe_Pass / Inputting correct code into “Safe”]</w:t>
-      </w:r>
-    </w:p>
-    <w:p>
-      <w:pPr>
-        <w:rPr>
-          <w:i/>
-          <w:iCs/>
-        </w:rPr>
-      </w:pPr>
-      <w:r>
-        <w:rPr>
-          <w:i/>
-          <w:iCs/>
-        </w:rPr>
-        <w:t>You have a feeling that if you take the gun, this will all be over.</w:t>
-      </w:r>
-    </w:p>
-    <w:p>
-      <w:pPr>
-        <w:rPr>
-          <w:i/>
-          <w:iCs/>
-        </w:rPr>
-      </w:pPr>
-      <w:r>
-        <w:rPr>
-          <w:i/>
-          <w:iCs/>
-        </w:rPr>
-        <w:t>Or...</w:t>
-      </w:r>
-    </w:p>
-    <w:p>
-      <w:r>
-        <w:t>[72]</w:t>
+        <w:t xml:space="preserve">The liquid </w:t>
+      </w:r>
+      <w:r>
+        <w:rPr>
+          <w:i/>
+          <w:iCs/>
+        </w:rPr>
+        <w:t xml:space="preserve">separates in the vial. </w:t>
+      </w:r>
+      <w:r>
+        <w:rPr>
+          <w:i/>
+          <w:iCs/>
+        </w:rPr>
+        <w:t>Clearly, something’s wron</w:t>
+      </w:r>
+      <w:r>
+        <w:rPr>
+          <w:i/>
+          <w:iCs/>
+        </w:rPr>
+        <w:t xml:space="preserve">g here. </w:t>
+      </w:r>
+    </w:p>
+    <w:p>
+      <w:r>
+        <w:t>[67]</w:t>
       </w:r>
     </w:p>
     <w:p>
@@ -1463,154 +1843,18 @@
         <w:t>1</w:t>
       </w:r>
     </w:p>
-    <w:p>
-      <w:pPr>
-        <w:rPr>
-          <w:i/>
-          <w:iCs/>
-        </w:rPr>
-      </w:pPr>
-    </w:p>
-    <w:p>
-      <w:r>
-        <w:t>[Lab_Interact / Interacting with “Lab Equipment” for the first time]</w:t>
-      </w:r>
-    </w:p>
-    <w:p>
-      <w:pPr>
-        <w:rPr>
-          <w:i/>
-          <w:iCs/>
-        </w:rPr>
-      </w:pPr>
-      <w:r>
-        <w:rPr>
-          <w:i/>
-          <w:iCs/>
-        </w:rPr>
-        <w:t xml:space="preserve">There’s some sort of cobbled-together mechanism here. </w:t>
-      </w:r>
-    </w:p>
-    <w:p>
-      <w:pPr>
-        <w:rPr>
-          <w:i/>
-          <w:iCs/>
-        </w:rPr>
-      </w:pPr>
-      <w:r>
-        <w:rPr>
-          <w:i/>
-          <w:iCs/>
-        </w:rPr>
-        <w:t>Something about the construction tells you that if you just put the ingredients in one end, that tube will spit them out in liquid form.</w:t>
-      </w:r>
-    </w:p>
-    <w:p>
-      <w:pPr>
-        <w:rPr>
-          <w:i/>
-          <w:iCs/>
-        </w:rPr>
-      </w:pPr>
-      <w:r>
-        <w:rPr>
-          <w:i/>
-          <w:iCs/>
-        </w:rPr>
-        <w:t xml:space="preserve">You wonder what </w:t>
-      </w:r>
-      <w:r>
-        <w:rPr>
-          <w:i/>
-          <w:iCs/>
-        </w:rPr>
-        <w:t>the man</w:t>
-      </w:r>
-      <w:r>
-        <w:rPr>
-          <w:i/>
-          <w:iCs/>
-        </w:rPr>
-        <w:t xml:space="preserve"> could possibly need something like this for.  </w:t>
-      </w:r>
-    </w:p>
-    <w:p>
-      <w:r>
-        <w:t>[255]</w:t>
-      </w:r>
-    </w:p>
-    <w:p>
-      <w:pPr>
-        <w:rPr>
-          <w:i/>
-          <w:iCs/>
-        </w:rPr>
-      </w:pPr>
-      <w:r>
-        <w:t>2</w:t>
-      </w:r>
-    </w:p>
     <w:p/>
     <w:p>
       <w:r>
         <w:t>[</w:t>
       </w:r>
-      <w:r>
-        <w:t>Lab_Fail / Wrong final cure]</w:t>
-      </w:r>
-    </w:p>
-    <w:p>
-      <w:pPr>
-        <w:rPr>
-          <w:i/>
-          <w:iCs/>
-        </w:rPr>
-      </w:pPr>
-      <w:r>
-        <w:rPr>
-          <w:i/>
-          <w:iCs/>
-        </w:rPr>
-        <w:t xml:space="preserve">The liquid </w:t>
-      </w:r>
-      <w:r>
-        <w:rPr>
-          <w:i/>
-          <w:iCs/>
-        </w:rPr>
-        <w:t xml:space="preserve">separates in the vial. </w:t>
-      </w:r>
-      <w:r>
-        <w:rPr>
-          <w:i/>
-          <w:iCs/>
-        </w:rPr>
-        <w:t>Clearly, something’s wron</w:t>
-      </w:r>
-      <w:r>
-        <w:rPr>
-          <w:i/>
-          <w:iCs/>
-        </w:rPr>
-        <w:t xml:space="preserve">g here. </w:t>
-      </w:r>
-    </w:p>
-    <w:p>
-      <w:r>
-        <w:lastRenderedPageBreak/>
-        <w:t>[67]</w:t>
-      </w:r>
-    </w:p>
-    <w:p>
-      <w:r>
-        <w:t>1</w:t>
-      </w:r>
-    </w:p>
-    <w:p/>
-    <w:p>
-      <w:r>
-        <w:t>[Lab_Pass / Correct final cure]</w:t>
+      <w:proofErr w:type="spellStart"/>
+      <w:r>
+        <w:t>Lab_Pass</w:t>
+      </w:r>
+      <w:proofErr w:type="spellEnd"/>
+      <w:r>
+        <w:t xml:space="preserve"> / Correct final cure]</w:t>
       </w:r>
     </w:p>
     <w:p>
@@ -1668,7 +1912,15 @@
     </w:p>
     <w:p>
       <w:r>
-        <w:t>[Man_Passive /</w:t>
+        <w:t>[</w:t>
+      </w:r>
+      <w:proofErr w:type="spellStart"/>
+      <w:r>
+        <w:t>Man_Passive</w:t>
+      </w:r>
+      <w:proofErr w:type="spellEnd"/>
+      <w:r>
+        <w:t xml:space="preserve"> /</w:t>
       </w:r>
       <w:r>
         <w:t xml:space="preserve"> 1 /</w:t>
@@ -1701,10 +1953,15 @@
     <w:p/>
     <w:p>
       <w:r>
-        <w:t xml:space="preserve">[Man_Passive / 2 / </w:t>
-      </w:r>
-      <w:r>
-        <w:t>Dialogue with no trigger condition]</w:t>
+        <w:t>[</w:t>
+      </w:r>
+      <w:proofErr w:type="spellStart"/>
+      <w:r>
+        <w:t>Man_Passive</w:t>
+      </w:r>
+      <w:proofErr w:type="spellEnd"/>
+      <w:r>
+        <w:t xml:space="preserve"> / 2 / Dialogue with no trigger condition]</w:t>
       </w:r>
     </w:p>
     <w:p>
@@ -1728,13 +1985,15 @@
     <w:p/>
     <w:p>
       <w:r>
-        <w:t xml:space="preserve">[Man_Passive / </w:t>
-      </w:r>
-      <w:r>
-        <w:t>3</w:t>
-      </w:r>
-      <w:r>
-        <w:t xml:space="preserve"> / Dialogue with no trigger condition]</w:t>
+        <w:t>[</w:t>
+      </w:r>
+      <w:proofErr w:type="spellStart"/>
+      <w:r>
+        <w:t>Man_Passive</w:t>
+      </w:r>
+      <w:proofErr w:type="spellEnd"/>
+      <w:r>
+        <w:t xml:space="preserve"> / 3 / Dialogue with no trigger condition]</w:t>
       </w:r>
     </w:p>
     <w:p>
@@ -1758,7 +2017,15 @@
     <w:p/>
     <w:p>
       <w:r>
-        <w:t>[Man_Passive / 2 / Dialogue with no trigger condition]</w:t>
+        <w:t>[</w:t>
+      </w:r>
+      <w:proofErr w:type="spellStart"/>
+      <w:r>
+        <w:t>Man_Passive</w:t>
+      </w:r>
+      <w:proofErr w:type="spellEnd"/>
+      <w:r>
+        <w:t xml:space="preserve"> / 2 / Dialogue with no trigger condition]</w:t>
       </w:r>
     </w:p>
     <w:p>
@@ -1771,7 +2038,6 @@
     </w:p>
     <w:p>
       <w:r>
-        <w:lastRenderedPageBreak/>
         <w:t>[11]</w:t>
       </w:r>
     </w:p>
@@ -1783,7 +2049,15 @@
     <w:p/>
     <w:p>
       <w:r>
-        <w:t>[Man_Passive / 2 / Dialogue with no trigger condition]</w:t>
+        <w:t>[</w:t>
+      </w:r>
+      <w:proofErr w:type="spellStart"/>
+      <w:r>
+        <w:t>Man_Passive</w:t>
+      </w:r>
+      <w:proofErr w:type="spellEnd"/>
+      <w:r>
+        <w:t xml:space="preserve"> / 2 / Dialogue with no trigger condition]</w:t>
       </w:r>
     </w:p>
     <w:p>
@@ -1827,8 +2101,13 @@
     </w:p>
     <w:p>
       <w:r>
-        <w:t>[Opening_Cutscene</w:t>
-      </w:r>
+        <w:t>[</w:t>
+      </w:r>
+      <w:proofErr w:type="spellStart"/>
+      <w:r>
+        <w:t>Opening_Cutscene</w:t>
+      </w:r>
+      <w:proofErr w:type="spellEnd"/>
       <w:r>
         <w:t xml:space="preserve"> / Plays when starting game]</w:t>
       </w:r>
@@ -2389,6 +2668,7 @@
           </w:tcPr>
           <w:p>
             <w:r>
+              <w:lastRenderedPageBreak/>
               <w:t>Protagonist</w:t>
             </w:r>
           </w:p>
@@ -2839,7 +3119,6 @@
           </w:tcPr>
           <w:p>
             <w:r>
-              <w:lastRenderedPageBreak/>
               <w:t>Man</w:t>
             </w:r>
           </w:p>
@@ -3188,7 +3467,15 @@
     <w:p/>
     <w:p>
       <w:r>
-        <w:t>[Gun_Cutscene / Ending when taking gun from Safe]</w:t>
+        <w:t>[</w:t>
+      </w:r>
+      <w:proofErr w:type="spellStart"/>
+      <w:r>
+        <w:t>Gun_Cutscene</w:t>
+      </w:r>
+      <w:proofErr w:type="spellEnd"/>
+      <w:r>
+        <w:t xml:space="preserve"> / Ending when taking gun from Safe]</w:t>
       </w:r>
     </w:p>
     <w:tbl>
@@ -3541,7 +3828,15 @@
     <w:p/>
     <w:p>
       <w:r>
-        <w:t>[Cure_Cutscene / Ending when injecting man with Cure]</w:t>
+        <w:t>[</w:t>
+      </w:r>
+      <w:proofErr w:type="spellStart"/>
+      <w:r>
+        <w:t>Cure_Cutscene</w:t>
+      </w:r>
+      <w:proofErr w:type="spellEnd"/>
+      <w:r>
+        <w:t xml:space="preserve"> / Ending when injecting man with Cure]</w:t>
       </w:r>
     </w:p>
     <w:tbl>
@@ -3766,6 +4061,7 @@
           </w:tcPr>
           <w:p>
             <w:r>
+              <w:lastRenderedPageBreak/>
               <w:t>Man</w:t>
             </w:r>
           </w:p>
@@ -4035,7 +4331,15 @@
     <w:p/>
     <w:p>
       <w:r>
-        <w:t xml:space="preserve">[Loss_Cutscene / </w:t>
+        <w:t>[</w:t>
+      </w:r>
+      <w:proofErr w:type="spellStart"/>
+      <w:r>
+        <w:t>Loss_Cutscene</w:t>
+      </w:r>
+      <w:proofErr w:type="spellEnd"/>
+      <w:r>
+        <w:t xml:space="preserve"> / </w:t>
       </w:r>
       <w:r>
         <w:t>Timer up]</w:t>
@@ -4182,7 +4486,6 @@
           </w:tcPr>
           <w:p>
             <w:r>
-              <w:lastRenderedPageBreak/>
               <w:t>Man</w:t>
             </w:r>
           </w:p>
@@ -4273,13 +4576,697 @@
           </w:tcPr>
           <w:p>
             <w:r>
-              <w:t>Loud thunk. Sounds of chewing.</w:t>
+              <w:t xml:space="preserve">Loud </w:t>
+            </w:r>
+            <w:proofErr w:type="spellStart"/>
+            <w:proofErr w:type="gramStart"/>
+            <w:r>
+              <w:t>thunk</w:t>
+            </w:r>
+            <w:proofErr w:type="spellEnd"/>
+            <w:proofErr w:type="gramEnd"/>
+            <w:r>
+              <w:t>. Sounds of chewing.</w:t>
             </w:r>
           </w:p>
         </w:tc>
       </w:tr>
     </w:tbl>
     <w:p/>
+    <w:p/>
+    <w:p>
+      <w:pPr>
+        <w:rPr>
+          <w:b/>
+          <w:bCs/>
+          <w:i/>
+          <w:iCs/>
+        </w:rPr>
+      </w:pPr>
+      <w:r>
+        <w:rPr>
+          <w:b/>
+          <w:bCs/>
+          <w:i/>
+          <w:iCs/>
+        </w:rPr>
+        <w:t>Deprecated</w:t>
+      </w:r>
+      <w:r>
+        <w:rPr>
+          <w:b/>
+          <w:bCs/>
+          <w:i/>
+          <w:iCs/>
+        </w:rPr>
+        <w:t>/Extended Docs</w:t>
+      </w:r>
+      <w:r>
+        <w:rPr>
+          <w:b/>
+          <w:bCs/>
+          <w:i/>
+          <w:iCs/>
+        </w:rPr>
+        <w:t>:</w:t>
+      </w:r>
+    </w:p>
+    <w:p>
+      <w:r>
+        <w:t>[</w:t>
+      </w:r>
+      <w:proofErr w:type="spellStart"/>
+      <w:r>
+        <w:t>Diary_Doc</w:t>
+      </w:r>
+      <w:proofErr w:type="spellEnd"/>
+      <w:r>
+        <w:t xml:space="preserve"> / 1 / Interacting with “Diary” item]</w:t>
+      </w:r>
+    </w:p>
+    <w:p>
+      <w:pPr>
+        <w:rPr>
+          <w:i/>
+          <w:iCs/>
+        </w:rPr>
+      </w:pPr>
+      <w:r>
+        <w:rPr>
+          <w:i/>
+          <w:iCs/>
+        </w:rPr>
+        <w:t>There’s something scrawled on the inside of the front cover.</w:t>
+      </w:r>
+    </w:p>
+    <w:p>
+      <w:r>
+        <w:t xml:space="preserve">“Your kids’ names are Bella and Sydney. Bella is 12. Sydney is 2. </w:t>
+      </w:r>
+    </w:p>
+    <w:p>
+      <w:r>
+        <w:t xml:space="preserve">“Bella doesn’t like milk or vegetables. Sydney is still having a hard time with solid foods. (Her yogurt is on the top shelf of the fridge because she keeps getting into </w:t>
+      </w:r>
+      <w:proofErr w:type="spellStart"/>
+      <w:r>
+        <w:t>there</w:t>
+      </w:r>
+      <w:proofErr w:type="spellEnd"/>
+      <w:r>
+        <w:t xml:space="preserve"> somehow. DO NOT LET HER HAVE IT WHENEVER SHE WANTS!!!)</w:t>
+      </w:r>
+    </w:p>
+    <w:p>
+      <w:r>
+        <w:t>“Brigette is dead. You haven’t forgotten that part yet, but the girls will get sad if you bring it up.”</w:t>
+      </w:r>
+    </w:p>
+    <w:p>
+      <w:r>
+        <w:t>[459]</w:t>
+      </w:r>
+    </w:p>
+    <w:p>
+      <w:r>
+        <w:t>1</w:t>
+      </w:r>
+    </w:p>
+    <w:p>
+      <w:pPr>
+        <w:rPr>
+          <w:i/>
+          <w:iCs/>
+        </w:rPr>
+      </w:pPr>
+    </w:p>
+    <w:p>
+      <w:r>
+        <w:t>[</w:t>
+      </w:r>
+      <w:proofErr w:type="spellStart"/>
+      <w:r>
+        <w:t>Diary_Doc</w:t>
+      </w:r>
+      <w:proofErr w:type="spellEnd"/>
+      <w:r>
+        <w:t xml:space="preserve"> / 2 / Interacting with “Diary” item]</w:t>
+      </w:r>
+    </w:p>
+    <w:p>
+      <w:pPr>
+        <w:rPr>
+          <w:i/>
+          <w:iCs/>
+        </w:rPr>
+      </w:pPr>
+      <w:r>
+        <w:rPr>
+          <w:i/>
+          <w:iCs/>
+        </w:rPr>
+        <w:t>There’s some red pen in the margin...</w:t>
+      </w:r>
+    </w:p>
+    <w:p>
+      <w:r>
+        <w:t xml:space="preserve">“Brigette </w:t>
+      </w:r>
+      <w:proofErr w:type="spellStart"/>
+      <w:r>
+        <w:t>brigette</w:t>
+      </w:r>
+      <w:proofErr w:type="spellEnd"/>
+      <w:r>
+        <w:t xml:space="preserve"> </w:t>
+      </w:r>
+      <w:proofErr w:type="spellStart"/>
+      <w:r>
+        <w:t>briggete</w:t>
+      </w:r>
+      <w:proofErr w:type="spellEnd"/>
+      <w:r>
+        <w:t xml:space="preserve"> don’t forget what you did”</w:t>
+      </w:r>
+    </w:p>
+    <w:p>
+      <w:r>
+        <w:t>[91]</w:t>
+      </w:r>
+    </w:p>
+    <w:p>
+      <w:r>
+        <w:lastRenderedPageBreak/>
+        <w:t>1</w:t>
+      </w:r>
+    </w:p>
+    <w:p/>
+    <w:p>
+      <w:r>
+        <w:t>[</w:t>
+      </w:r>
+      <w:proofErr w:type="spellStart"/>
+      <w:r>
+        <w:t>Diary_Doc</w:t>
+      </w:r>
+      <w:proofErr w:type="spellEnd"/>
+      <w:r>
+        <w:t xml:space="preserve"> / 3 / Interacting with “Diary” item]</w:t>
+      </w:r>
+    </w:p>
+    <w:p>
+      <w:pPr>
+        <w:rPr>
+          <w:i/>
+          <w:iCs/>
+        </w:rPr>
+      </w:pPr>
+      <w:r>
+        <w:rPr>
+          <w:i/>
+          <w:iCs/>
+        </w:rPr>
+        <w:t xml:space="preserve">This entry seems earlier than the front cover text. The pen is darker. </w:t>
+      </w:r>
+    </w:p>
+    <w:p>
+      <w:r>
+        <w:t>“Moon on 6</w:t>
+      </w:r>
+      <w:r>
+        <w:rPr>
+          <w:vertAlign w:val="superscript"/>
+        </w:rPr>
+        <w:t>th</w:t>
+      </w:r>
+      <w:r>
+        <w:t xml:space="preserve"> this month</w:t>
+      </w:r>
+    </w:p>
+    <w:p>
+      <w:r>
+        <w:t>“Go to store for eggs, bagels, deli meat, wheat bread</w:t>
+      </w:r>
+    </w:p>
+    <w:p>
+      <w:r>
+        <w:t>“Call Janet to sit the kids</w:t>
+      </w:r>
+    </w:p>
+    <w:p>
+      <w:r>
+        <w:t>“NEED NEW BOARDS FOR THE CABIN ASAP!!!”</w:t>
+      </w:r>
+    </w:p>
+    <w:p>
+      <w:r>
+        <w:t>[213]</w:t>
+      </w:r>
+    </w:p>
+    <w:p>
+      <w:r>
+        <w:t>1</w:t>
+      </w:r>
+    </w:p>
+    <w:p/>
+    <w:p>
+      <w:r>
+        <w:t>[</w:t>
+      </w:r>
+      <w:proofErr w:type="spellStart"/>
+      <w:r>
+        <w:t>Diary_Doc</w:t>
+      </w:r>
+      <w:proofErr w:type="spellEnd"/>
+      <w:r>
+        <w:t xml:space="preserve"> / 4 / Interacting with “Diary” item]</w:t>
+      </w:r>
+    </w:p>
+    <w:p>
+      <w:r>
+        <w:t>“Looking into colloidal silver for my condition – might turn me blue??? &lt;- LOOK INTO THIS</w:t>
+      </w:r>
+    </w:p>
+    <w:p>
+      <w:r>
+        <w:t xml:space="preserve">“DON’T FORGET Bella’s soccer practice on Tues and Thurs again!! </w:t>
+      </w:r>
+    </w:p>
+    <w:p>
+      <w:r>
+        <w:t>“look up daycare ratings”</w:t>
+      </w:r>
+    </w:p>
+    <w:p>
+      <w:r>
+        <w:t>[178]</w:t>
+      </w:r>
+    </w:p>
+    <w:p>
+      <w:r>
+        <w:t>1</w:t>
+      </w:r>
+    </w:p>
+    <w:p/>
+    <w:p>
+      <w:r>
+        <w:t>[</w:t>
+      </w:r>
+      <w:proofErr w:type="spellStart"/>
+      <w:r>
+        <w:t>Diary_Doc</w:t>
+      </w:r>
+      <w:proofErr w:type="spellEnd"/>
+      <w:r>
+        <w:t xml:space="preserve"> / 5 / Interacting with “Diary” item]</w:t>
+      </w:r>
+    </w:p>
+    <w:p>
+      <w:r>
+        <w:t>“Boards good to go</w:t>
+      </w:r>
+    </w:p>
+    <w:p>
+      <w:r>
+        <w:t>“Janet sitting kids for 2 nights... told her I’m visiting Brigette</w:t>
+      </w:r>
+    </w:p>
+    <w:p>
+      <w:r>
+        <w:t xml:space="preserve">“visit Brigette sometime soon” </w:t>
+      </w:r>
+    </w:p>
+    <w:p>
+      <w:r>
+        <w:t>[115]</w:t>
+      </w:r>
+    </w:p>
+    <w:p>
+      <w:r>
+        <w:t>1</w:t>
+      </w:r>
+    </w:p>
+    <w:p/>
+    <w:p>
+      <w:r>
+        <w:t>[</w:t>
+      </w:r>
+      <w:proofErr w:type="spellStart"/>
+      <w:r>
+        <w:t>Diary_Doc</w:t>
+      </w:r>
+      <w:proofErr w:type="spellEnd"/>
+      <w:r>
+        <w:t xml:space="preserve"> / 6 / Interacting with “Diary” item]</w:t>
+      </w:r>
+    </w:p>
+    <w:p>
+      <w:pPr>
+        <w:rPr>
+          <w:i/>
+          <w:iCs/>
+        </w:rPr>
+      </w:pPr>
+      <w:r>
+        <w:rPr>
+          <w:i/>
+          <w:iCs/>
+        </w:rPr>
+        <w:t xml:space="preserve">There’s a lot of pages torn out after this. </w:t>
+      </w:r>
+    </w:p>
+    <w:p>
+      <w:r>
+        <w:lastRenderedPageBreak/>
+        <w:t>“Moon on the 18</w:t>
+      </w:r>
+      <w:r>
+        <w:rPr>
+          <w:vertAlign w:val="superscript"/>
+        </w:rPr>
+        <w:t>th</w:t>
+      </w:r>
+      <w:r>
+        <w:t xml:space="preserve"> this month</w:t>
+      </w:r>
+    </w:p>
+    <w:p>
+      <w:r>
+        <w:t>“Moon on the 18</w:t>
+      </w:r>
+      <w:r>
+        <w:rPr>
+          <w:vertAlign w:val="superscript"/>
+        </w:rPr>
+        <w:t>th</w:t>
+      </w:r>
+      <w:r>
+        <w:t xml:space="preserve"> this month</w:t>
+      </w:r>
+    </w:p>
+    <w:p>
+      <w:r>
+        <w:t xml:space="preserve">“I </w:t>
+      </w:r>
+      <w:proofErr w:type="spellStart"/>
+      <w:r>
+        <w:t>dont</w:t>
+      </w:r>
+      <w:proofErr w:type="spellEnd"/>
+      <w:r>
+        <w:t xml:space="preserve"> like the way this new </w:t>
+      </w:r>
+      <w:proofErr w:type="spellStart"/>
+      <w:r>
+        <w:t>treatmnt</w:t>
+      </w:r>
+      <w:proofErr w:type="spellEnd"/>
+      <w:r>
+        <w:t xml:space="preserve"> makes me feel with all these mushrooms and tonics and I honestly don’t think </w:t>
+      </w:r>
+      <w:proofErr w:type="spellStart"/>
+      <w:proofErr w:type="gramStart"/>
+      <w:r>
+        <w:t>its</w:t>
+      </w:r>
+      <w:proofErr w:type="spellEnd"/>
+      <w:proofErr w:type="gramEnd"/>
+      <w:r>
+        <w:t xml:space="preserve"> getting any better </w:t>
+      </w:r>
+    </w:p>
+    <w:p>
+      <w:r>
+        <w:t xml:space="preserve">“my head gets so </w:t>
+      </w:r>
+      <w:proofErr w:type="spellStart"/>
+      <w:r>
+        <w:t>spinny</w:t>
+      </w:r>
+      <w:proofErr w:type="spellEnd"/>
+      <w:r>
+        <w:t xml:space="preserve"> all the days before the moon and </w:t>
+      </w:r>
+      <w:proofErr w:type="gramStart"/>
+      <w:r>
+        <w:t>its</w:t>
+      </w:r>
+      <w:proofErr w:type="gramEnd"/>
+      <w:r>
+        <w:t xml:space="preserve"> getting hard to remember any of the things I have to do</w:t>
+      </w:r>
+    </w:p>
+    <w:p>
+      <w:r>
+        <w:t>“Brigette looked me in the eyes and asked me where her dad gone and i don’t remember who her dad is or how she got in my house until I did”</w:t>
+      </w:r>
+    </w:p>
+    <w:p>
+      <w:r>
+        <w:t>[494]</w:t>
+      </w:r>
+    </w:p>
+    <w:p>
+      <w:r>
+        <w:t>1</w:t>
+      </w:r>
+    </w:p>
+    <w:p/>
+    <w:p>
+      <w:r>
+        <w:t>[</w:t>
+      </w:r>
+      <w:proofErr w:type="spellStart"/>
+      <w:r>
+        <w:t>Diary_Doc</w:t>
+      </w:r>
+      <w:proofErr w:type="spellEnd"/>
+      <w:r>
+        <w:t xml:space="preserve"> / 7 / Interacting with “Diary” item]</w:t>
+      </w:r>
+    </w:p>
+    <w:p>
+      <w:r>
+        <w:t>“Get milk, yogurt at store</w:t>
+      </w:r>
+    </w:p>
+    <w:p>
+      <w:r>
+        <w:t>“Get more ginseng at that market... seems to help with the memory loss</w:t>
+      </w:r>
+    </w:p>
+    <w:p>
+      <w:r>
+        <w:t>“Find Brigette’s obit”</w:t>
+      </w:r>
+    </w:p>
+    <w:p>
+      <w:r>
+        <w:t>[118]</w:t>
+      </w:r>
+    </w:p>
+    <w:p>
+      <w:r>
+        <w:t>1</w:t>
+      </w:r>
+    </w:p>
+    <w:p/>
+    <w:p>
+      <w:r>
+        <w:t>[</w:t>
+      </w:r>
+      <w:proofErr w:type="spellStart"/>
+      <w:r>
+        <w:t>Diary_Doc</w:t>
+      </w:r>
+      <w:proofErr w:type="spellEnd"/>
+      <w:r>
+        <w:t xml:space="preserve"> / 8 / Interacting with “Diary” item]</w:t>
+      </w:r>
+    </w:p>
+    <w:p>
+      <w:r>
+        <w:t>“More boards for cabin</w:t>
+      </w:r>
+    </w:p>
+    <w:p>
+      <w:r>
+        <w:t>“Ask Janet if she can take the kids for a couple weeks</w:t>
+      </w:r>
+    </w:p>
+    <w:p>
+      <w:r>
+        <w:t xml:space="preserve">“SYDNEY and BELLA SYDNEY </w:t>
+      </w:r>
+      <w:r>
+        <w:tab/>
+        <w:t>and BELLA  and SYNDEY BELL</w:t>
+      </w:r>
+    </w:p>
+    <w:p>
+      <w:r>
+        <w:t>“On the phone you will say: Hello Janet I hope you’re having a good evening would you mind taking Syndey and Bela for a little while I need to figure out how Brigette died for a bit and then I’ll be fine until next month when it will happen again and I’m sorry it happens again</w:t>
+      </w:r>
+    </w:p>
+    <w:p>
+      <w:r>
+        <w:t>“DON’T FORGET”</w:t>
+      </w:r>
+    </w:p>
+    <w:p>
+      <w:r>
+        <w:t>[419]</w:t>
+      </w:r>
+    </w:p>
+    <w:p>
+      <w:r>
+        <w:t>1</w:t>
+      </w:r>
+    </w:p>
+    <w:p/>
+    <w:p>
+      <w:r>
+        <w:lastRenderedPageBreak/>
+        <w:t>[</w:t>
+      </w:r>
+      <w:proofErr w:type="spellStart"/>
+      <w:r>
+        <w:t>Diary_Doc</w:t>
+      </w:r>
+      <w:proofErr w:type="spellEnd"/>
+      <w:r>
+        <w:t xml:space="preserve"> / 9 / Interacting with “Diary” item]</w:t>
+      </w:r>
+    </w:p>
+    <w:p>
+      <w:pPr>
+        <w:rPr>
+          <w:i/>
+          <w:iCs/>
+        </w:rPr>
+      </w:pPr>
+      <w:r>
+        <w:rPr>
+          <w:i/>
+          <w:iCs/>
+        </w:rPr>
+        <w:t>More missing pages.</w:t>
+      </w:r>
+    </w:p>
+    <w:p>
+      <w:r>
+        <w:t>“I am so lonely in here and so restless</w:t>
+      </w:r>
+    </w:p>
+    <w:p>
+      <w:r>
+        <w:t>“There is no one on the outside of here I have boarded myself in like the allegory of the cave and I wonder if the world is more scared of me or I of IT!!!</w:t>
+      </w:r>
+    </w:p>
+    <w:p>
+      <w:r>
+        <w:t xml:space="preserve">“I see under my hands a very familiar woman and I am looking down at her through a fisheye and she is stretching and her mouth is pulling out and open like drowning above air and I realize it’s just the hammer as I nail another board but my hands are still around its </w:t>
+      </w:r>
+      <w:proofErr w:type="spellStart"/>
+      <w:r>
+        <w:t>neeeeck</w:t>
+      </w:r>
+      <w:proofErr w:type="spellEnd"/>
+    </w:p>
+    <w:p>
+      <w:r>
+        <w:t xml:space="preserve">“visit </w:t>
+      </w:r>
+      <w:proofErr w:type="spellStart"/>
+      <w:r>
+        <w:t>brigette</w:t>
+      </w:r>
+      <w:proofErr w:type="spellEnd"/>
+      <w:r>
+        <w:t xml:space="preserve"> soon”</w:t>
+      </w:r>
+    </w:p>
+    <w:p>
+      <w:r>
+        <w:t>[509]</w:t>
+      </w:r>
+    </w:p>
+    <w:p>
+      <w:r>
+        <w:t>1</w:t>
+      </w:r>
+    </w:p>
+    <w:p/>
+    <w:p>
+      <w:r>
+        <w:t>[</w:t>
+      </w:r>
+      <w:proofErr w:type="spellStart"/>
+      <w:r>
+        <w:t>Diary_Doc</w:t>
+      </w:r>
+      <w:proofErr w:type="spellEnd"/>
+      <w:r>
+        <w:t xml:space="preserve"> / 10 / Interacting with “Diary” item]</w:t>
+      </w:r>
+    </w:p>
+    <w:p>
+      <w:r>
+        <w:t xml:space="preserve">“Moon </w:t>
+      </w:r>
+      <w:proofErr w:type="spellStart"/>
+      <w:r>
+        <w:t>tonite</w:t>
+      </w:r>
+      <w:proofErr w:type="spellEnd"/>
+      <w:r>
+        <w:t xml:space="preserve"> moon </w:t>
+      </w:r>
+      <w:proofErr w:type="spellStart"/>
+      <w:r>
+        <w:t>tonite</w:t>
+      </w:r>
+      <w:proofErr w:type="spellEnd"/>
+      <w:r>
+        <w:t xml:space="preserve"> moon</w:t>
+      </w:r>
+    </w:p>
+    <w:p>
+      <w:r>
+        <w:t xml:space="preserve">“there is something I need in the cabinet shiny silver glinting </w:t>
+      </w:r>
+      <w:proofErr w:type="gramStart"/>
+      <w:r>
+        <w:t>red blue</w:t>
+      </w:r>
+      <w:proofErr w:type="gramEnd"/>
+      <w:r>
+        <w:t xml:space="preserve"> yellow green</w:t>
+      </w:r>
+    </w:p>
+    <w:p>
+      <w:r>
+        <w:t>“the beam will hit and I will be whole again”</w:t>
+      </w:r>
+    </w:p>
+    <w:p>
+      <w:r>
+        <w:t>[149]</w:t>
+      </w:r>
+    </w:p>
+    <w:p>
+      <w:r>
+        <w:t>1</w:t>
+      </w:r>
+    </w:p>
+    <w:p>
+      <w:pPr>
+        <w:rPr>
+          <w:b/>
+          <w:bCs/>
+        </w:rPr>
+      </w:pPr>
+    </w:p>
     <w:sectPr>
       <w:pgSz w:w="12240" w:h="15840"/>
       <w:pgMar w:top="1440" w:right="1440" w:bottom="1440" w:left="1440" w:header="720" w:footer="720" w:gutter="0"/>
@@ -4288,6 +5275,56 @@
     </w:sectPr>
   </w:body>
 </w:document>
+</file>
+
+<file path=word/endnotes.xml><?xml version="1.0" encoding="utf-8"?>
+<w:endnotes xmlns:wpc="http://schemas.microsoft.com/office/word/2010/wordprocessingCanvas" xmlns:cx="http://schemas.microsoft.com/office/drawing/2014/chartex" xmlns:cx1="http://schemas.microsoft.com/office/drawing/2015/9/8/chartex" xmlns:cx2="http://schemas.microsoft.com/office/drawing/2015/10/21/chartex" xmlns:cx3="http://schemas.microsoft.com/office/drawing/2016/5/9/chartex" xmlns:cx4="http://schemas.microsoft.com/office/drawing/2016/5/10/chartex" xmlns:cx5="http://schemas.microsoft.com/office/drawing/2016/5/11/chartex" xmlns:cx6="http://schemas.microsoft.com/office/drawing/2016/5/12/chartex" xmlns:cx7="http://schemas.microsoft.com/office/drawing/2016/5/13/chartex" xmlns:cx8="http://schemas.microsoft.com/office/drawing/2016/5/14/chartex" xmlns:mc="http://schemas.openxmlformats.org/markup-compatibility/2006" xmlns:aink="http://schemas.microsoft.com/office/drawing/2016/ink" xmlns:am3d="http://schemas.microsoft.com/office/drawing/2017/model3d" xmlns:o="urn:schemas-microsoft-com:office:office" xmlns:oel="http://schemas.microsoft.com/office/2019/extlst" xmlns:r="http://schemas.openxmlformats.org/officeDocument/2006/relationships" xmlns:m="http://schemas.openxmlformats.org/officeDocument/2006/math" xmlns:v="urn:schemas-microsoft-com:vml" xmlns:wp14="http://schemas.microsoft.com/office/word/2010/wordprocessingDrawing" xmlns:wp="http://schemas.openxmlformats.org/drawingml/2006/wordprocessingDrawing" xmlns:w10="urn:schemas-microsoft-com:office:word" xmlns:w="http://schemas.openxmlformats.org/wordprocessingml/2006/main" xmlns:w14="http://schemas.microsoft.com/office/word/2010/wordml" xmlns:w15="http://schemas.microsoft.com/office/word/2012/wordml" xmlns:w16cei="http://schemas.microsoft.com/office/word/2026/wordml/cei" xmlns:w16cex="http://schemas.microsoft.com/office/word/2018/wordml/cex" xmlns:w16cid="http://schemas.microsoft.com/office/word/2016/wordml/cid" xmlns:w16="http://schemas.microsoft.com/office/word/2018/wordml" xmlns:w16du="http://schemas.microsoft.com/office/word/2023/wordml/word16du" xmlns:w16sdtdh="http://schemas.microsoft.com/office/word/2020/wordml/sdtdatahash" xmlns:w16sdtfl="http://schemas.microsoft.com/office/word/2024/wordml/sdtformatlock" xmlns:w16se="http://schemas.microsoft.com/office/word/2015/wordml/symex" xmlns:wpg="http://schemas.microsoft.com/office/word/2010/wordprocessingGroup" xmlns:wpi="http://schemas.microsoft.com/office/word/2010/wordprocessingInk" xmlns:wne="http://schemas.microsoft.com/office/word/2006/wordml" xmlns:wps="http://schemas.microsoft.com/office/word/2010/wordprocessingShape" mc:Ignorable="w14 w15 w16se w16cid w16 w16cex w16sdtdh w16sdtfl w16du wp14">
+  <w:endnote w:type="separator" w:id="-1">
+    <w:p>
+      <w:pPr>
+        <w:spacing w:after="0" w:line="240" w:lineRule="auto"/>
+      </w:pPr>
+      <w:r>
+        <w:separator/>
+      </w:r>
+    </w:p>
+  </w:endnote>
+  <w:endnote w:type="continuationSeparator" w:id="0">
+    <w:p>
+      <w:pPr>
+        <w:spacing w:after="0" w:line="240" w:lineRule="auto"/>
+      </w:pPr>
+      <w:r>
+        <w:continuationSeparator/>
+      </w:r>
+    </w:p>
+  </w:endnote>
+</w:endnotes>
+</file>
+
+<file path=word/footnotes.xml><?xml version="1.0" encoding="utf-8"?>
+<w:footnotes xmlns:wpc="http://schemas.microsoft.com/office/word/2010/wordprocessingCanvas" xmlns:cx="http://schemas.microsoft.com/office/drawing/2014/chartex" xmlns:cx1="http://schemas.microsoft.com/office/drawing/2015/9/8/chartex" xmlns:cx2="http://schemas.microsoft.com/office/drawing/2015/10/21/chartex" xmlns:cx3="http://schemas.microsoft.com/office/drawing/2016/5/9/chartex" xmlns:cx4="http://schemas.microsoft.com/office/drawing/2016/5/10/chartex" xmlns:cx5="http://schemas.microsoft.com/office/drawing/2016/5/11/chartex" xmlns:cx6="http://schemas.microsoft.com/office/drawing/2016/5/12/chartex" xmlns:cx7="http://schemas.microsoft.com/office/drawing/2016/5/13/chartex" xmlns:cx8="http://schemas.microsoft.com/office/drawing/2016/5/14/chartex" xmlns:mc="http://schemas.openxmlformats.org/markup-compatibility/2006" xmlns:aink="http://schemas.microsoft.com/office/drawing/2016/ink" xmlns:am3d="http://schemas.microsoft.com/office/drawing/2017/model3d" xmlns:o="urn:schemas-microsoft-com:office:office" xmlns:oel="http://schemas.microsoft.com/office/2019/extlst" xmlns:r="http://schemas.openxmlformats.org/officeDocument/2006/relationships" xmlns:m="http://schemas.openxmlformats.org/officeDocument/2006/math" xmlns:v="urn:schemas-microsoft-com:vml" xmlns:wp14="http://schemas.microsoft.com/office/word/2010/wordprocessingDrawing" xmlns:wp="http://schemas.openxmlformats.org/drawingml/2006/wordprocessingDrawing" xmlns:w10="urn:schemas-microsoft-com:office:word" xmlns:w="http://schemas.openxmlformats.org/wordprocessingml/2006/main" xmlns:w14="http://schemas.microsoft.com/office/word/2010/wordml" xmlns:w15="http://schemas.microsoft.com/office/word/2012/wordml" xmlns:w16cei="http://schemas.microsoft.com/office/word/2026/wordml/cei" xmlns:w16cex="http://schemas.microsoft.com/office/word/2018/wordml/cex" xmlns:w16cid="http://schemas.microsoft.com/office/word/2016/wordml/cid" xmlns:w16="http://schemas.microsoft.com/office/word/2018/wordml" xmlns:w16du="http://schemas.microsoft.com/office/word/2023/wordml/word16du" xmlns:w16sdtdh="http://schemas.microsoft.com/office/word/2020/wordml/sdtdatahash" xmlns:w16sdtfl="http://schemas.microsoft.com/office/word/2024/wordml/sdtformatlock" xmlns:w16se="http://schemas.microsoft.com/office/word/2015/wordml/symex" xmlns:wpg="http://schemas.microsoft.com/office/word/2010/wordprocessingGroup" xmlns:wpi="http://schemas.microsoft.com/office/word/2010/wordprocessingInk" xmlns:wne="http://schemas.microsoft.com/office/word/2006/wordml" xmlns:wps="http://schemas.microsoft.com/office/word/2010/wordprocessingShape" mc:Ignorable="w14 w15 w16se w16cid w16 w16cex w16sdtdh w16sdtfl w16du wp14">
+  <w:footnote w:type="separator" w:id="-1">
+    <w:p>
+      <w:pPr>
+        <w:spacing w:after="0" w:line="240" w:lineRule="auto"/>
+      </w:pPr>
+      <w:r>
+        <w:separator/>
+      </w:r>
+    </w:p>
+  </w:footnote>
+  <w:footnote w:type="continuationSeparator" w:id="0">
+    <w:p>
+      <w:pPr>
+        <w:spacing w:after="0" w:line="240" w:lineRule="auto"/>
+      </w:pPr>
+      <w:r>
+        <w:continuationSeparator/>
+      </w:r>
+    </w:p>
+  </w:footnote>
+</w:footnotes>
 </file>
 
 <file path=word/styles.xml><?xml version="1.0" encoding="utf-8"?>
@@ -4897,7 +5934,6 @@
   <w:style w:type="character" w:default="1" w:styleId="DefaultParagraphFont">
     <w:name w:val="Default Paragraph Font"/>
     <w:uiPriority w:val="1"/>
-    <w:semiHidden/>
     <w:unhideWhenUsed/>
   </w:style>
   <w:style w:type="table" w:default="1" w:styleId="TableNormal">
@@ -5295,6 +6331,56 @@
       </w:rPr>
     </w:tblStylePr>
   </w:style>
+  <w:style w:type="paragraph" w:styleId="Header">
+    <w:name w:val="header"/>
+    <w:basedOn w:val="Normal"/>
+    <w:link w:val="HeaderChar"/>
+    <w:uiPriority w:val="99"/>
+    <w:unhideWhenUsed/>
+    <w:rsid w:val="00325952"/>
+    <w:pPr>
+      <w:tabs>
+        <w:tab w:val="center" w:pos="4680"/>
+        <w:tab w:val="right" w:pos="9360"/>
+      </w:tabs>
+      <w:spacing w:after="0" w:line="240" w:lineRule="auto"/>
+    </w:pPr>
+  </w:style>
+  <w:style w:type="character" w:customStyle="1" w:styleId="HeaderChar">
+    <w:name w:val="Header Char"/>
+    <w:basedOn w:val="DefaultParagraphFont"/>
+    <w:link w:val="Header"/>
+    <w:uiPriority w:val="99"/>
+    <w:rsid w:val="00325952"/>
+    <w:rPr>
+      <w:sz w:val="22"/>
+    </w:rPr>
+  </w:style>
+  <w:style w:type="paragraph" w:styleId="Footer">
+    <w:name w:val="footer"/>
+    <w:basedOn w:val="Normal"/>
+    <w:link w:val="FooterChar"/>
+    <w:uiPriority w:val="99"/>
+    <w:unhideWhenUsed/>
+    <w:rsid w:val="00325952"/>
+    <w:pPr>
+      <w:tabs>
+        <w:tab w:val="center" w:pos="4680"/>
+        <w:tab w:val="right" w:pos="9360"/>
+      </w:tabs>
+      <w:spacing w:after="0" w:line="240" w:lineRule="auto"/>
+    </w:pPr>
+  </w:style>
+  <w:style w:type="character" w:customStyle="1" w:styleId="FooterChar">
+    <w:name w:val="Footer Char"/>
+    <w:basedOn w:val="DefaultParagraphFont"/>
+    <w:link w:val="Footer"/>
+    <w:uiPriority w:val="99"/>
+    <w:rsid w:val="00325952"/>
+    <w:rPr>
+      <w:sz w:val="22"/>
+    </w:rPr>
+  </w:style>
 </w:styles>
 </file>
 

</xml_diff>